<commit_message>
Render diagrams as self-contained SVG (visible offline, no CDN)
- Engine now renders every diagram to a dependency-free SVG (kind-aware:
  flow, layered architecture, sequence and radial layouts) stored on the
  Diagram model as render_svg, alongside the editable source.
- Web reader embeds the inline SVG directly, so diagrams always display with
  no external renderer or internet (fixes diagrams not showing in the viewer).
- HTML export inlines the same SVG (self-contained, offline-capable).
- Markdown export gains a diagram_mode (source for .md, svg for HTML).
- Re-published the 12-book demo corpus with rendered diagrams; README updated.

Co-authored-by: ankit05121980 <ankit05121980@users.noreply.github.com>
</commit_message>
<xml_diff>
--- a/content/agentic-ai/agentic-ai-foundations/agentic-ai-foundations.docx
+++ b/content/agentic-ai/agentic-ai-foundations/agentic-ai-foundations.docx
@@ -2263,45 +2263,41 @@
           <w:rFonts w:ascii="Consolas" w:hAnsi="Consolas"/>
           <w:sz w:val="16"/>
         </w:rPr>
-        <w:t>&lt;svg xmlns="http://www.w3.org/2000/svg" width="760" height="360" viewBox="0 0 760 360" font-family="Inter, Arial, sans-serif"&gt;</w:t>
-        <w:br/>
-        <w:t>&lt;rect width="760" height="360" fill="#f8fafc"/&gt;</w:t>
-        <w:br/>
-        <w:t>&lt;text x="380" y="34" text-anchor="middle" font-size="20" font-weight="700" fill="#0f172a"&gt;Capability Map - Planning and Task Decomposition&lt;/text&gt;</w:t>
-        <w:br/>
-        <w:t>&lt;rect x="290" y="162" width="180" height="56" rx="12" fill="#0f172a"/&gt;</w:t>
-        <w:br/>
-        <w:t>&lt;text x="380" y="195" text-anchor="middle" font-size="14" font-weight="700" fill="#ffffff"&gt;Agentic AI&lt;/text&gt;</w:t>
-        <w:br/>
-        <w:t>&lt;line x1="380" y1="190" x2="380" y2="70" stroke="#94a3b8" stroke-width="2"/&gt;</w:t>
-        <w:br/>
-        <w:t>&lt;rect x="308" y="48" width="144" height="44" rx="10" fill="#ffffff" stroke="#2563eb" stroke-width="2"/&gt;</w:t>
-        <w:br/>
-        <w:t>&lt;text x="380" y="74" text-anchor="middle" font-size="11" fill="#0f172a"&gt;From Chatbots to Ag…&lt;/text&gt;</w:t>
-        <w:br/>
-        <w:t>&lt;line x1="380" y1="190" x2="617" y2="153" stroke="#94a3b8" stroke-width="2"/&gt;</w:t>
-        <w:br/>
-        <w:t>&lt;rect x="545" y="131" width="144" height="44" rx="10" fill="#ffffff" stroke="#7c3aed" stroke-width="2"/&gt;</w:t>
-        <w:br/>
-        <w:t>&lt;text x="617" y="157" text-anchor="middle" font-size="11" fill="#0f172a"&gt;The Agent Loop: Rea…&lt;/text&gt;</w:t>
-        <w:br/>
-        <w:t>&lt;line x1="380" y1="190" x2="526" y2="287" stroke="#94a3b8" stroke-width="2"/&gt;</w:t>
-        <w:br/>
-        <w:t>&lt;rect x="454" y="265" width="144" height="44" rx="10" fill="#ffffff" stroke="#0891b2" stroke-width="2"/&gt;</w:t>
-        <w:br/>
-        <w:t>&lt;text x="526" y="291" text-anchor="middle" font-size="11" fill="#0f172a"&gt;Planning and Task D…&lt;/text&gt;</w:t>
-        <w:br/>
-        <w:t>&lt;line x1="380" y1="190" x2="234" y2="287" stroke="#94a3b8" stroke-width="2"/&gt;</w:t>
-        <w:br/>
-        <w:t>&lt;rect x="162" y="265" width="144" height="44" rx="10" fill="#ffffff" stroke="#059669" stroke-width="2"/&gt;</w:t>
-        <w:br/>
-        <w:t>&lt;text x="234" y="291" text-anchor="middle" font-size="11" fill="#0f172a"&gt;Tool Use and Functi…&lt;/text&gt;</w:t>
-        <w:br/>
-        <w:t>&lt;line x1="380" y1="190" x2="143" y2="153" stroke="#94a3b8" stroke-width="2"/&gt;</w:t>
-        <w:br/>
-        <w:t>&lt;rect x="71" y="131" width="144" height="44" rx="10" fill="#ffffff" stroke="#d97706" stroke-width="2"/&gt;</w:t>
-        <w:br/>
-        <w:t>&lt;text x="143" y="157" text-anchor="middle" font-size="11" fill="#0f172a"&gt;Memory Architectures&lt;/text&gt;</w:t>
+        <w:t>&lt;svg xmlns="http://www.w3.org/2000/svg" width="760" height="380" viewBox="0 0 760 380" font-family="Inter, Segoe UI, Arial, sans-serif"&gt;</w:t>
+        <w:br/>
+        <w:t>&lt;defs&gt;&lt;marker id="arrow" markerWidth="10" markerHeight="10" refX="8" refY="3" orient="auto" markerUnits="strokeWidth"&gt;&lt;path d="M0,0 L8,3 L0,6 z" fill="#94a3b8"/&gt;&lt;/marker&gt;&lt;marker id="arrowA" markerWidth="10" markerHeight="10" refX="8" refY="3" orient="auto" markerUnits="strokeWidth"&gt;&lt;path d="M0,0 L8,3 L0,6 z" fill="#4338ca"/&gt;&lt;/marker&gt;&lt;/defs&gt;</w:t>
+        <w:br/>
+        <w:t>&lt;rect width="760" height="380" rx="12" fill="#f8fafc"/&gt;</w:t>
+        <w:br/>
+        <w:t>&lt;text x="380" y="30" text-anchor="middle" font-size="17" font-weight="700" fill="#0f172a"&gt;Capability Map - Planning and Task Decomposition&lt;/text&gt;</w:t>
+        <w:br/>
+        <w:t>&lt;circle cx="380.0" cy="198.0" r="46" fill="#0f172a"/&gt;</w:t>
+        <w:br/>
+        <w:t>&lt;text x="380.0" y="202.0" text-anchor="middle" font-size="12" font-weight="700" fill="#ffffff"&gt;Agentic AI&lt;/text&gt;</w:t>
+        <w:br/>
+        <w:t>&lt;line x1="380.0" y1="152.0" x2="380.0" y2="92.0" stroke="#94a3b8" stroke-width="2" marker-end="url(#arrow)"/&gt;</w:t>
+        <w:br/>
+        <w:t>&lt;rect x="306.0" y="58.0" width="148" height="44" rx="10" fill="#ffffff" stroke="#4338ca" stroke-width="2"/&gt;&lt;text x="380.0" y="83.74" text-anchor="middle" font-size="11" font-weight="600" fill="#0f172a"&gt;From Chatbots to Agents&lt;/text&gt;</w:t>
+        <w:br/>
+        <w:t>&lt;line x1="419.83716857408416" y1="175.0" x2="575.7217412552832" y2="145.0" stroke="#94a3b8" stroke-width="2" marker-end="url(#arrow)"/&gt;</w:t>
+        <w:br/>
+        <w:t>&lt;rect x="522.5063509461097" y="117.0" width="148" height="44" rx="10" fill="#ffffff" stroke="#7c3aed" stroke-width="2"/&gt;&lt;text x="596.5063509461097" y="142.74" text-anchor="middle" font-size="11" font-weight="600" fill="#0f172a"&gt;The Agent Loop: Reason,…&lt;/text&gt;</w:t>
+        <w:br/>
+        <w:t>&lt;line x1="419.83716857408416" y1="221.0" x2="575.7217412552832" y2="251.0" stroke="#94a3b8" stroke-width="2" marker-end="url(#arrow)"/&gt;</w:t>
+        <w:br/>
+        <w:t>&lt;rect x="522.5063509461097" y="235.0" width="148" height="44" rx="10" fill="#ffffff" stroke="#0891b2" stroke-width="2"/&gt;&lt;text x="596.5063509461097" y="260.74" text-anchor="middle" font-size="11" font-weight="600" fill="#0f172a"&gt;Planning and Task Decom…&lt;/text&gt;</w:t>
+        <w:br/>
+        <w:t>&lt;line x1="380.0" y1="244.0" x2="380.0" y2="304.0" stroke="#94a3b8" stroke-width="2" marker-end="url(#arrow)"/&gt;</w:t>
+        <w:br/>
+        <w:t>&lt;rect x="306.0" y="294.0" width="148" height="44" rx="10" fill="#ffffff" stroke="#059669" stroke-width="2"/&gt;&lt;text x="380.0" y="319.74" text-anchor="middle" font-size="11" font-weight="600" fill="#0f172a"&gt;Tool Use and Function C…&lt;/text&gt;</w:t>
+        <w:br/>
+        <w:t>&lt;line x1="340.16283142591584" y1="221.0" x2="184.2782587447169" y2="251.00000000000006" stroke="#94a3b8" stroke-width="2" marker-end="url(#arrow)"/&gt;</w:t>
+        <w:br/>
+        <w:t>&lt;rect x="89.49364905389038" y="235.00000000000006" width="148" height="44" rx="10" fill="#ffffff" stroke="#d97706" stroke-width="2"/&gt;&lt;text x="163.49364905389038" y="260.74000000000007" text-anchor="middle" font-size="11" font-weight="600" fill="#0f172a"&gt;Memory Architectures&lt;/text&gt;</w:t>
+        <w:br/>
+        <w:t>&lt;line x1="340.16283142591584" y1="175.0" x2="184.27825874471688" y2="145.0" stroke="#94a3b8" stroke-width="2" marker-end="url(#arrow)"/&gt;</w:t>
+        <w:br/>
+        <w:t>&lt;rect x="89.49364905389035" y="117.0" width="148" height="44" rx="10" fill="#ffffff" stroke="#dc2626" stroke-width="2"/&gt;&lt;text x="163.49364905389035" y="142.74" text-anchor="middle" font-size="11" font-weight="600" fill="#0f172a"&gt;Reflection and Self-Cor…&lt;/text&gt;</w:t>
         <w:br/>
         <w:t>&lt;/svg&gt;</w:t>
       </w:r>
@@ -3900,45 +3896,51 @@
           <w:rFonts w:ascii="Consolas" w:hAnsi="Consolas"/>
           <w:sz w:val="16"/>
         </w:rPr>
-        <w:t>&lt;svg xmlns="http://www.w3.org/2000/svg" width="760" height="360" viewBox="0 0 760 360" font-family="Inter, Arial, sans-serif"&gt;</w:t>
-        <w:br/>
-        <w:t>&lt;rect width="760" height="360" fill="#f8fafc"/&gt;</w:t>
-        <w:br/>
-        <w:t>&lt;text x="380" y="34" text-anchor="middle" font-size="20" font-weight="700" fill="#0f172a"&gt;Cloud Architecture - Memory Architectures&lt;/text&gt;</w:t>
-        <w:br/>
-        <w:t>&lt;rect x="290" y="162" width="180" height="56" rx="12" fill="#0f172a"/&gt;</w:t>
-        <w:br/>
-        <w:t>&lt;text x="380" y="195" text-anchor="middle" font-size="14" font-weight="700" fill="#ffffff"&gt;Agentic AI&lt;/text&gt;</w:t>
-        <w:br/>
-        <w:t>&lt;line x1="380" y1="190" x2="380" y2="70" stroke="#94a3b8" stroke-width="2"/&gt;</w:t>
-        <w:br/>
-        <w:t>&lt;rect x="308" y="48" width="144" height="44" rx="10" fill="#ffffff" stroke="#2563eb" stroke-width="2"/&gt;</w:t>
-        <w:br/>
-        <w:t>&lt;text x="380" y="74" text-anchor="middle" font-size="11" fill="#0f172a"&gt;From Chatbots to Ag…&lt;/text&gt;</w:t>
-        <w:br/>
-        <w:t>&lt;line x1="380" y1="190" x2="617" y2="153" stroke="#94a3b8" stroke-width="2"/&gt;</w:t>
-        <w:br/>
-        <w:t>&lt;rect x="545" y="131" width="144" height="44" rx="10" fill="#ffffff" stroke="#7c3aed" stroke-width="2"/&gt;</w:t>
-        <w:br/>
-        <w:t>&lt;text x="617" y="157" text-anchor="middle" font-size="11" fill="#0f172a"&gt;The Agent Loop: Rea…&lt;/text&gt;</w:t>
-        <w:br/>
-        <w:t>&lt;line x1="380" y1="190" x2="526" y2="287" stroke="#94a3b8" stroke-width="2"/&gt;</w:t>
-        <w:br/>
-        <w:t>&lt;rect x="454" y="265" width="144" height="44" rx="10" fill="#ffffff" stroke="#0891b2" stroke-width="2"/&gt;</w:t>
-        <w:br/>
-        <w:t>&lt;text x="526" y="291" text-anchor="middle" font-size="11" fill="#0f172a"&gt;Planning and Task D…&lt;/text&gt;</w:t>
-        <w:br/>
-        <w:t>&lt;line x1="380" y1="190" x2="234" y2="287" stroke="#94a3b8" stroke-width="2"/&gt;</w:t>
-        <w:br/>
-        <w:t>&lt;rect x="162" y="265" width="144" height="44" rx="10" fill="#ffffff" stroke="#059669" stroke-width="2"/&gt;</w:t>
-        <w:br/>
-        <w:t>&lt;text x="234" y="291" text-anchor="middle" font-size="11" fill="#0f172a"&gt;Tool Use and Functi…&lt;/text&gt;</w:t>
-        <w:br/>
-        <w:t>&lt;line x1="380" y1="190" x2="143" y2="153" stroke="#94a3b8" stroke-width="2"/&gt;</w:t>
-        <w:br/>
-        <w:t>&lt;rect x="71" y="131" width="144" height="44" rx="10" fill="#ffffff" stroke="#d97706" stroke-width="2"/&gt;</w:t>
-        <w:br/>
-        <w:t>&lt;text x="143" y="157" text-anchor="middle" font-size="11" fill="#0f172a"&gt;Memory Architectures&lt;/text&gt;</w:t>
+        <w:t>&lt;svg xmlns="http://www.w3.org/2000/svg" width="760" height="380" viewBox="0 0 760 380" font-family="Inter, Segoe UI, Arial, sans-serif"&gt;</w:t>
+        <w:br/>
+        <w:t>&lt;defs&gt;&lt;marker id="arrow" markerWidth="10" markerHeight="10" refX="8" refY="3" orient="auto" markerUnits="strokeWidth"&gt;&lt;path d="M0,0 L8,3 L0,6 z" fill="#94a3b8"/&gt;&lt;/marker&gt;&lt;marker id="arrowA" markerWidth="10" markerHeight="10" refX="8" refY="3" orient="auto" markerUnits="strokeWidth"&gt;&lt;path d="M0,0 L8,3 L0,6 z" fill="#4338ca"/&gt;&lt;/marker&gt;&lt;/defs&gt;</w:t>
+        <w:br/>
+        <w:t>&lt;rect width="760" height="380" rx="12" fill="#f8fafc"/&gt;</w:t>
+        <w:br/>
+        <w:t>&lt;text x="380" y="30" text-anchor="middle" font-size="17" font-weight="700" fill="#0f172a"&gt;Cloud Architecture - Memory Architectures&lt;/text&gt;</w:t>
+        <w:br/>
+        <w:t>&lt;rect x="30" y="48" width="700" height="96" rx="12" fill="#eef2ff" stroke="#e2e8f0"/&gt;</w:t>
+        <w:br/>
+        <w:t>&lt;text x="44" y="66" font-size="11" font-weight="700" fill="#475569"&gt;Consumers&lt;/text&gt;</w:t>
+        <w:br/>
+        <w:t>&lt;rect x="44" y="78" width="150" height="48" rx="10" fill="#ffffff" stroke="#4338ca" stroke-width="2"/&gt;&lt;text x="119.0" y="105.74" text-anchor="middle" font-size="11" font-weight="600" fill="#0f172a"&gt;Users / Apps&lt;/text&gt;</w:t>
+        <w:br/>
+        <w:t>&lt;rect x="208" y="78" width="150" height="48" rx="10" fill="#ffffff" stroke="#7c3aed" stroke-width="2"/&gt;&lt;text x="283.0" y="105.74" text-anchor="middle" font-size="11" font-weight="600" fill="#0f172a"&gt;API Clients&lt;/text&gt;</w:t>
+        <w:br/>
+        <w:t>&lt;rect x="30" y="166" width="700" height="96" rx="12" fill="#f5f3ff" stroke="#e2e8f0"/&gt;</w:t>
+        <w:br/>
+        <w:t>&lt;text x="44" y="184" font-size="11" font-weight="700" fill="#475569"&gt;Agentic AI Platform&lt;/text&gt;</w:t>
+        <w:br/>
+        <w:t>&lt;rect x="44.0" y="196" width="122.8" height="48" rx="10" fill="#ffffff" stroke="#7c3aed" stroke-width="2"/&gt;&lt;text x="105.4" y="223.74" text-anchor="middle" font-size="11" font-weight="600" fill="#0f172a"&gt;Gateway&lt;/text&gt;</w:t>
+        <w:br/>
+        <w:t>&lt;rect x="180.8" y="196" width="122.8" height="48" rx="10" fill="#ffffff" stroke="#0891b2" stroke-width="2"/&gt;&lt;text x="242.20000000000002" y="223.74" text-anchor="middle" font-size="11" font-weight="600" fill="#0f172a"&gt;From Chatbots to A…&lt;/text&gt;</w:t>
+        <w:br/>
+        <w:t>&lt;rect x="317.6" y="196" width="122.8" height="48" rx="10" fill="#ffffff" stroke="#059669" stroke-width="2"/&gt;&lt;text x="379.0" y="223.74" text-anchor="middle" font-size="11" font-weight="600" fill="#0f172a"&gt;The Agent Loop: Re…&lt;/text&gt;</w:t>
+        <w:br/>
+        <w:t>&lt;rect x="454.40000000000003" y="196" width="122.8" height="48" rx="10" fill="#ffffff" stroke="#d97706" stroke-width="2"/&gt;&lt;text x="515.8000000000001" y="223.74" text-anchor="middle" font-size="11" font-weight="600" fill="#0f172a"&gt;Planning and Task …&lt;/text&gt;</w:t>
+        <w:br/>
+        <w:t>&lt;rect x="591.2" y="196" width="122.8" height="48" rx="10" fill="#ffffff" stroke="#dc2626" stroke-width="2"/&gt;&lt;text x="652.6" y="223.74" text-anchor="middle" font-size="11" font-weight="600" fill="#0f172a"&gt;Tool Use and Funct…&lt;/text&gt;</w:t>
+        <w:br/>
+        <w:t>&lt;rect x="30" y="284" width="700" height="96" rx="12" fill="#ecfeff" stroke="#e2e8f0"/&gt;</w:t>
+        <w:br/>
+        <w:t>&lt;text x="44" y="302" font-size="11" font-weight="700" fill="#475569"&gt;Data &amp;amp; Operations&lt;/text&gt;</w:t>
+        <w:br/>
+        <w:t>&lt;rect x="44" y="314" width="150" height="48" rx="10" fill="#ffffff" stroke="#0891b2" stroke-width="2"/&gt;&lt;text x="119.0" y="341.74" text-anchor="middle" font-size="11" font-weight="600" fill="#0f172a"&gt;Primary Store&lt;/text&gt;</w:t>
+        <w:br/>
+        <w:t>&lt;rect x="208" y="314" width="150" height="48" rx="10" fill="#ffffff" stroke="#059669" stroke-width="2"/&gt;&lt;text x="283.0" y="341.74" text-anchor="middle" font-size="11" font-weight="600" fill="#0f172a"&gt;Vector Index&lt;/text&gt;</w:t>
+        <w:br/>
+        <w:t>&lt;rect x="372" y="314" width="150" height="48" rx="10" fill="#ffffff" stroke="#d97706" stroke-width="2"/&gt;&lt;text x="447.0" y="341.74" text-anchor="middle" font-size="11" font-weight="600" fill="#0f172a"&gt;Observability&lt;/text&gt;</w:t>
+        <w:br/>
+        <w:t>&lt;rect x="536" y="314" width="150" height="48" rx="10" fill="#ffffff" stroke="#dc2626" stroke-width="2"/&gt;&lt;text x="611.0" y="341.74" text-anchor="middle" font-size="11" font-weight="600" fill="#0f172a"&gt;Security&lt;/text&gt;</w:t>
+        <w:br/>
+        <w:t>&lt;line x1="380.0" y1="126" x2="380.0" y2="196" stroke="#4338ca" stroke-width="2" marker-end="url(#arrowA)"/&gt;</w:t>
+        <w:br/>
+        <w:t>&lt;line x1="380.0" y1="244" x2="380.0" y2="314" stroke="#4338ca" stroke-width="2" marker-end="url(#arrowA)"/&gt;</w:t>
         <w:br/>
         <w:t>&lt;/svg&gt;</w:t>
       </w:r>
@@ -3965,45 +3967,41 @@
           <w:rFonts w:ascii="Consolas" w:hAnsi="Consolas"/>
           <w:sz w:val="16"/>
         </w:rPr>
-        <w:t>&lt;svg xmlns="http://www.w3.org/2000/svg" width="760" height="360" viewBox="0 0 760 360" font-family="Inter, Arial, sans-serif"&gt;</w:t>
-        <w:br/>
-        <w:t>&lt;rect width="760" height="360" fill="#f8fafc"/&gt;</w:t>
-        <w:br/>
-        <w:t>&lt;text x="380" y="34" text-anchor="middle" font-size="20" font-weight="700" fill="#0f172a"&gt;Knowledge Graph - Memory Architectures&lt;/text&gt;</w:t>
-        <w:br/>
-        <w:t>&lt;rect x="290" y="162" width="180" height="56" rx="12" fill="#0f172a"/&gt;</w:t>
-        <w:br/>
-        <w:t>&lt;text x="380" y="195" text-anchor="middle" font-size="14" font-weight="700" fill="#ffffff"&gt;Agentic AI&lt;/text&gt;</w:t>
-        <w:br/>
-        <w:t>&lt;line x1="380" y1="190" x2="380" y2="70" stroke="#94a3b8" stroke-width="2"/&gt;</w:t>
-        <w:br/>
-        <w:t>&lt;rect x="308" y="48" width="144" height="44" rx="10" fill="#ffffff" stroke="#2563eb" stroke-width="2"/&gt;</w:t>
-        <w:br/>
-        <w:t>&lt;text x="380" y="74" text-anchor="middle" font-size="11" fill="#0f172a"&gt;From Chatbots to Ag…&lt;/text&gt;</w:t>
-        <w:br/>
-        <w:t>&lt;line x1="380" y1="190" x2="617" y2="153" stroke="#94a3b8" stroke-width="2"/&gt;</w:t>
-        <w:br/>
-        <w:t>&lt;rect x="545" y="131" width="144" height="44" rx="10" fill="#ffffff" stroke="#7c3aed" stroke-width="2"/&gt;</w:t>
-        <w:br/>
-        <w:t>&lt;text x="617" y="157" text-anchor="middle" font-size="11" fill="#0f172a"&gt;The Agent Loop: Rea…&lt;/text&gt;</w:t>
-        <w:br/>
-        <w:t>&lt;line x1="380" y1="190" x2="526" y2="287" stroke="#94a3b8" stroke-width="2"/&gt;</w:t>
-        <w:br/>
-        <w:t>&lt;rect x="454" y="265" width="144" height="44" rx="10" fill="#ffffff" stroke="#0891b2" stroke-width="2"/&gt;</w:t>
-        <w:br/>
-        <w:t>&lt;text x="526" y="291" text-anchor="middle" font-size="11" fill="#0f172a"&gt;Planning and Task D…&lt;/text&gt;</w:t>
-        <w:br/>
-        <w:t>&lt;line x1="380" y1="190" x2="234" y2="287" stroke="#94a3b8" stroke-width="2"/&gt;</w:t>
-        <w:br/>
-        <w:t>&lt;rect x="162" y="265" width="144" height="44" rx="10" fill="#ffffff" stroke="#059669" stroke-width="2"/&gt;</w:t>
-        <w:br/>
-        <w:t>&lt;text x="234" y="291" text-anchor="middle" font-size="11" fill="#0f172a"&gt;Tool Use and Functi…&lt;/text&gt;</w:t>
-        <w:br/>
-        <w:t>&lt;line x1="380" y1="190" x2="143" y2="153" stroke="#94a3b8" stroke-width="2"/&gt;</w:t>
-        <w:br/>
-        <w:t>&lt;rect x="71" y="131" width="144" height="44" rx="10" fill="#ffffff" stroke="#d97706" stroke-width="2"/&gt;</w:t>
-        <w:br/>
-        <w:t>&lt;text x="143" y="157" text-anchor="middle" font-size="11" fill="#0f172a"&gt;Memory Architectures&lt;/text&gt;</w:t>
+        <w:t>&lt;svg xmlns="http://www.w3.org/2000/svg" width="760" height="380" viewBox="0 0 760 380" font-family="Inter, Segoe UI, Arial, sans-serif"&gt;</w:t>
+        <w:br/>
+        <w:t>&lt;defs&gt;&lt;marker id="arrow" markerWidth="10" markerHeight="10" refX="8" refY="3" orient="auto" markerUnits="strokeWidth"&gt;&lt;path d="M0,0 L8,3 L0,6 z" fill="#94a3b8"/&gt;&lt;/marker&gt;&lt;marker id="arrowA" markerWidth="10" markerHeight="10" refX="8" refY="3" orient="auto" markerUnits="strokeWidth"&gt;&lt;path d="M0,0 L8,3 L0,6 z" fill="#4338ca"/&gt;&lt;/marker&gt;&lt;/defs&gt;</w:t>
+        <w:br/>
+        <w:t>&lt;rect width="760" height="380" rx="12" fill="#f8fafc"/&gt;</w:t>
+        <w:br/>
+        <w:t>&lt;text x="380" y="30" text-anchor="middle" font-size="17" font-weight="700" fill="#0f172a"&gt;Knowledge Graph - Memory Architectures&lt;/text&gt;</w:t>
+        <w:br/>
+        <w:t>&lt;circle cx="380.0" cy="198.0" r="46" fill="#0f172a"/&gt;</w:t>
+        <w:br/>
+        <w:t>&lt;text x="380.0" y="202.0" text-anchor="middle" font-size="12" font-weight="700" fill="#ffffff"&gt;Agentic AI&lt;/text&gt;</w:t>
+        <w:br/>
+        <w:t>&lt;line x1="380.0" y1="152.0" x2="380.0" y2="92.0" stroke="#94a3b8" stroke-width="2" marker-end="url(#arrow)"/&gt;</w:t>
+        <w:br/>
+        <w:t>&lt;rect x="306.0" y="58.0" width="148" height="44" rx="10" fill="#ffffff" stroke="#4338ca" stroke-width="2"/&gt;&lt;text x="380.0" y="83.74" text-anchor="middle" font-size="11" font-weight="600" fill="#0f172a"&gt;From Chatbots to Agents&lt;/text&gt;</w:t>
+        <w:br/>
+        <w:t>&lt;line x1="419.83716857408416" y1="175.0" x2="575.7217412552832" y2="145.0" stroke="#94a3b8" stroke-width="2" marker-end="url(#arrow)"/&gt;</w:t>
+        <w:br/>
+        <w:t>&lt;rect x="522.5063509461097" y="117.0" width="148" height="44" rx="10" fill="#ffffff" stroke="#7c3aed" stroke-width="2"/&gt;&lt;text x="596.5063509461097" y="142.74" text-anchor="middle" font-size="11" font-weight="600" fill="#0f172a"&gt;The Agent Loop: Reason,…&lt;/text&gt;</w:t>
+        <w:br/>
+        <w:t>&lt;line x1="419.83716857408416" y1="221.0" x2="575.7217412552832" y2="251.0" stroke="#94a3b8" stroke-width="2" marker-end="url(#arrow)"/&gt;</w:t>
+        <w:br/>
+        <w:t>&lt;rect x="522.5063509461097" y="235.0" width="148" height="44" rx="10" fill="#ffffff" stroke="#0891b2" stroke-width="2"/&gt;&lt;text x="596.5063509461097" y="260.74" text-anchor="middle" font-size="11" font-weight="600" fill="#0f172a"&gt;Planning and Task Decom…&lt;/text&gt;</w:t>
+        <w:br/>
+        <w:t>&lt;line x1="380.0" y1="244.0" x2="380.0" y2="304.0" stroke="#94a3b8" stroke-width="2" marker-end="url(#arrow)"/&gt;</w:t>
+        <w:br/>
+        <w:t>&lt;rect x="306.0" y="294.0" width="148" height="44" rx="10" fill="#ffffff" stroke="#059669" stroke-width="2"/&gt;&lt;text x="380.0" y="319.74" text-anchor="middle" font-size="11" font-weight="600" fill="#0f172a"&gt;Tool Use and Function C…&lt;/text&gt;</w:t>
+        <w:br/>
+        <w:t>&lt;line x1="340.16283142591584" y1="221.0" x2="184.2782587447169" y2="251.00000000000006" stroke="#94a3b8" stroke-width="2" marker-end="url(#arrow)"/&gt;</w:t>
+        <w:br/>
+        <w:t>&lt;rect x="89.49364905389038" y="235.00000000000006" width="148" height="44" rx="10" fill="#ffffff" stroke="#d97706" stroke-width="2"/&gt;&lt;text x="163.49364905389038" y="260.74000000000007" text-anchor="middle" font-size="11" font-weight="600" fill="#0f172a"&gt;Memory Architectures&lt;/text&gt;</w:t>
+        <w:br/>
+        <w:t>&lt;line x1="340.16283142591584" y1="175.0" x2="184.27825874471688" y2="145.0" stroke="#94a3b8" stroke-width="2" marker-end="url(#arrow)"/&gt;</w:t>
+        <w:br/>
+        <w:t>&lt;rect x="89.49364905389035" y="117.0" width="148" height="44" rx="10" fill="#ffffff" stroke="#dc2626" stroke-width="2"/&gt;&lt;text x="163.49364905389035" y="142.74" text-anchor="middle" font-size="11" font-weight="600" fill="#0f172a"&gt;Reflection and Self-Cor…&lt;/text&gt;</w:t>
         <w:br/>
         <w:t>&lt;/svg&gt;</w:t>
       </w:r>
@@ -4808,45 +4806,41 @@
           <w:rFonts w:ascii="Consolas" w:hAnsi="Consolas"/>
           <w:sz w:val="16"/>
         </w:rPr>
-        <w:t>&lt;svg xmlns="http://www.w3.org/2000/svg" width="760" height="360" viewBox="0 0 760 360" font-family="Inter, Arial, sans-serif"&gt;</w:t>
-        <w:br/>
-        <w:t>&lt;rect width="760" height="360" fill="#f8fafc"/&gt;</w:t>
-        <w:br/>
-        <w:t>&lt;text x="380" y="34" text-anchor="middle" font-size="20" font-weight="700" fill="#0f172a"&gt;Knowledge Graph - Reflection and Self-Correction&lt;/text&gt;</w:t>
-        <w:br/>
-        <w:t>&lt;rect x="290" y="162" width="180" height="56" rx="12" fill="#0f172a"/&gt;</w:t>
-        <w:br/>
-        <w:t>&lt;text x="380" y="195" text-anchor="middle" font-size="14" font-weight="700" fill="#ffffff"&gt;Agentic AI&lt;/text&gt;</w:t>
-        <w:br/>
-        <w:t>&lt;line x1="380" y1="190" x2="380" y2="70" stroke="#94a3b8" stroke-width="2"/&gt;</w:t>
-        <w:br/>
-        <w:t>&lt;rect x="308" y="48" width="144" height="44" rx="10" fill="#ffffff" stroke="#2563eb" stroke-width="2"/&gt;</w:t>
-        <w:br/>
-        <w:t>&lt;text x="380" y="74" text-anchor="middle" font-size="11" fill="#0f172a"&gt;From Chatbots to Ag…&lt;/text&gt;</w:t>
-        <w:br/>
-        <w:t>&lt;line x1="380" y1="190" x2="617" y2="153" stroke="#94a3b8" stroke-width="2"/&gt;</w:t>
-        <w:br/>
-        <w:t>&lt;rect x="545" y="131" width="144" height="44" rx="10" fill="#ffffff" stroke="#7c3aed" stroke-width="2"/&gt;</w:t>
-        <w:br/>
-        <w:t>&lt;text x="617" y="157" text-anchor="middle" font-size="11" fill="#0f172a"&gt;The Agent Loop: Rea…&lt;/text&gt;</w:t>
-        <w:br/>
-        <w:t>&lt;line x1="380" y1="190" x2="526" y2="287" stroke="#94a3b8" stroke-width="2"/&gt;</w:t>
-        <w:br/>
-        <w:t>&lt;rect x="454" y="265" width="144" height="44" rx="10" fill="#ffffff" stroke="#0891b2" stroke-width="2"/&gt;</w:t>
-        <w:br/>
-        <w:t>&lt;text x="526" y="291" text-anchor="middle" font-size="11" fill="#0f172a"&gt;Planning and Task D…&lt;/text&gt;</w:t>
-        <w:br/>
-        <w:t>&lt;line x1="380" y1="190" x2="234" y2="287" stroke="#94a3b8" stroke-width="2"/&gt;</w:t>
-        <w:br/>
-        <w:t>&lt;rect x="162" y="265" width="144" height="44" rx="10" fill="#ffffff" stroke="#059669" stroke-width="2"/&gt;</w:t>
-        <w:br/>
-        <w:t>&lt;text x="234" y="291" text-anchor="middle" font-size="11" fill="#0f172a"&gt;Tool Use and Functi…&lt;/text&gt;</w:t>
-        <w:br/>
-        <w:t>&lt;line x1="380" y1="190" x2="143" y2="153" stroke="#94a3b8" stroke-width="2"/&gt;</w:t>
-        <w:br/>
-        <w:t>&lt;rect x="71" y="131" width="144" height="44" rx="10" fill="#ffffff" stroke="#d97706" stroke-width="2"/&gt;</w:t>
-        <w:br/>
-        <w:t>&lt;text x="143" y="157" text-anchor="middle" font-size="11" fill="#0f172a"&gt;Memory Architectures&lt;/text&gt;</w:t>
+        <w:t>&lt;svg xmlns="http://www.w3.org/2000/svg" width="760" height="380" viewBox="0 0 760 380" font-family="Inter, Segoe UI, Arial, sans-serif"&gt;</w:t>
+        <w:br/>
+        <w:t>&lt;defs&gt;&lt;marker id="arrow" markerWidth="10" markerHeight="10" refX="8" refY="3" orient="auto" markerUnits="strokeWidth"&gt;&lt;path d="M0,0 L8,3 L0,6 z" fill="#94a3b8"/&gt;&lt;/marker&gt;&lt;marker id="arrowA" markerWidth="10" markerHeight="10" refX="8" refY="3" orient="auto" markerUnits="strokeWidth"&gt;&lt;path d="M0,0 L8,3 L0,6 z" fill="#4338ca"/&gt;&lt;/marker&gt;&lt;/defs&gt;</w:t>
+        <w:br/>
+        <w:t>&lt;rect width="760" height="380" rx="12" fill="#f8fafc"/&gt;</w:t>
+        <w:br/>
+        <w:t>&lt;text x="380" y="30" text-anchor="middle" font-size="17" font-weight="700" fill="#0f172a"&gt;Knowledge Graph - Reflection and Self-Correction&lt;/text&gt;</w:t>
+        <w:br/>
+        <w:t>&lt;circle cx="380.0" cy="198.0" r="46" fill="#0f172a"/&gt;</w:t>
+        <w:br/>
+        <w:t>&lt;text x="380.0" y="202.0" text-anchor="middle" font-size="12" font-weight="700" fill="#ffffff"&gt;Agentic AI&lt;/text&gt;</w:t>
+        <w:br/>
+        <w:t>&lt;line x1="380.0" y1="152.0" x2="380.0" y2="92.0" stroke="#94a3b8" stroke-width="2" marker-end="url(#arrow)"/&gt;</w:t>
+        <w:br/>
+        <w:t>&lt;rect x="306.0" y="58.0" width="148" height="44" rx="10" fill="#ffffff" stroke="#4338ca" stroke-width="2"/&gt;&lt;text x="380.0" y="83.74" text-anchor="middle" font-size="11" font-weight="600" fill="#0f172a"&gt;From Chatbots to Agents&lt;/text&gt;</w:t>
+        <w:br/>
+        <w:t>&lt;line x1="419.83716857408416" y1="175.0" x2="575.7217412552832" y2="145.0" stroke="#94a3b8" stroke-width="2" marker-end="url(#arrow)"/&gt;</w:t>
+        <w:br/>
+        <w:t>&lt;rect x="522.5063509461097" y="117.0" width="148" height="44" rx="10" fill="#ffffff" stroke="#7c3aed" stroke-width="2"/&gt;&lt;text x="596.5063509461097" y="142.74" text-anchor="middle" font-size="11" font-weight="600" fill="#0f172a"&gt;The Agent Loop: Reason,…&lt;/text&gt;</w:t>
+        <w:br/>
+        <w:t>&lt;line x1="419.83716857408416" y1="221.0" x2="575.7217412552832" y2="251.0" stroke="#94a3b8" stroke-width="2" marker-end="url(#arrow)"/&gt;</w:t>
+        <w:br/>
+        <w:t>&lt;rect x="522.5063509461097" y="235.0" width="148" height="44" rx="10" fill="#ffffff" stroke="#0891b2" stroke-width="2"/&gt;&lt;text x="596.5063509461097" y="260.74" text-anchor="middle" font-size="11" font-weight="600" fill="#0f172a"&gt;Planning and Task Decom…&lt;/text&gt;</w:t>
+        <w:br/>
+        <w:t>&lt;line x1="380.0" y1="244.0" x2="380.0" y2="304.0" stroke="#94a3b8" stroke-width="2" marker-end="url(#arrow)"/&gt;</w:t>
+        <w:br/>
+        <w:t>&lt;rect x="306.0" y="294.0" width="148" height="44" rx="10" fill="#ffffff" stroke="#059669" stroke-width="2"/&gt;&lt;text x="380.0" y="319.74" text-anchor="middle" font-size="11" font-weight="600" fill="#0f172a"&gt;Tool Use and Function C…&lt;/text&gt;</w:t>
+        <w:br/>
+        <w:t>&lt;line x1="340.16283142591584" y1="221.0" x2="184.2782587447169" y2="251.00000000000006" stroke="#94a3b8" stroke-width="2" marker-end="url(#arrow)"/&gt;</w:t>
+        <w:br/>
+        <w:t>&lt;rect x="89.49364905389038" y="235.00000000000006" width="148" height="44" rx="10" fill="#ffffff" stroke="#d97706" stroke-width="2"/&gt;&lt;text x="163.49364905389038" y="260.74000000000007" text-anchor="middle" font-size="11" font-weight="600" fill="#0f172a"&gt;Memory Architectures&lt;/text&gt;</w:t>
+        <w:br/>
+        <w:t>&lt;line x1="340.16283142591584" y1="175.0" x2="184.27825874471688" y2="145.0" stroke="#94a3b8" stroke-width="2" marker-end="url(#arrow)"/&gt;</w:t>
+        <w:br/>
+        <w:t>&lt;rect x="89.49364905389035" y="117.0" width="148" height="44" rx="10" fill="#ffffff" stroke="#dc2626" stroke-width="2"/&gt;&lt;text x="163.49364905389035" y="142.74" text-anchor="middle" font-size="11" font-weight="600" fill="#0f172a"&gt;Reflection and Self-Cor…&lt;/text&gt;</w:t>
         <w:br/>
         <w:t>&lt;/svg&gt;</w:t>
       </w:r>
@@ -13108,45 +13102,39 @@
           <w:rFonts w:ascii="Consolas" w:hAnsi="Consolas"/>
           <w:sz w:val="16"/>
         </w:rPr>
-        <w:t>&lt;svg xmlns="http://www.w3.org/2000/svg" width="760" height="360" viewBox="0 0 760 360" font-family="Inter, Arial, sans-serif"&gt;</w:t>
-        <w:br/>
-        <w:t>&lt;rect width="760" height="360" fill="#f8fafc"/&gt;</w:t>
-        <w:br/>
-        <w:t>&lt;text x="380" y="34" text-anchor="middle" font-size="20" font-weight="700" fill="#0f172a"&gt;Business Process - Hands-On Lab: Building an End-to-End…&lt;/text&gt;</w:t>
-        <w:br/>
-        <w:t>&lt;rect x="290" y="162" width="180" height="56" rx="12" fill="#0f172a"/&gt;</w:t>
-        <w:br/>
-        <w:t>&lt;text x="380" y="195" text-anchor="middle" font-size="14" font-weight="700" fill="#ffffff"&gt;Agentic AI&lt;/text&gt;</w:t>
-        <w:br/>
-        <w:t>&lt;line x1="380" y1="190" x2="380" y2="70" stroke="#94a3b8" stroke-width="2"/&gt;</w:t>
-        <w:br/>
-        <w:t>&lt;rect x="308" y="48" width="144" height="44" rx="10" fill="#ffffff" stroke="#2563eb" stroke-width="2"/&gt;</w:t>
-        <w:br/>
-        <w:t>&lt;text x="380" y="74" text-anchor="middle" font-size="11" fill="#0f172a"&gt;From Chatbots to Ag…&lt;/text&gt;</w:t>
-        <w:br/>
-        <w:t>&lt;line x1="380" y1="190" x2="617" y2="153" stroke="#94a3b8" stroke-width="2"/&gt;</w:t>
-        <w:br/>
-        <w:t>&lt;rect x="545" y="131" width="144" height="44" rx="10" fill="#ffffff" stroke="#7c3aed" stroke-width="2"/&gt;</w:t>
-        <w:br/>
-        <w:t>&lt;text x="617" y="157" text-anchor="middle" font-size="11" fill="#0f172a"&gt;The Agent Loop: Rea…&lt;/text&gt;</w:t>
-        <w:br/>
-        <w:t>&lt;line x1="380" y1="190" x2="526" y2="287" stroke="#94a3b8" stroke-width="2"/&gt;</w:t>
-        <w:br/>
-        <w:t>&lt;rect x="454" y="265" width="144" height="44" rx="10" fill="#ffffff" stroke="#0891b2" stroke-width="2"/&gt;</w:t>
-        <w:br/>
-        <w:t>&lt;text x="526" y="291" text-anchor="middle" font-size="11" fill="#0f172a"&gt;Planning and Task D…&lt;/text&gt;</w:t>
-        <w:br/>
-        <w:t>&lt;line x1="380" y1="190" x2="234" y2="287" stroke="#94a3b8" stroke-width="2"/&gt;</w:t>
-        <w:br/>
-        <w:t>&lt;rect x="162" y="265" width="144" height="44" rx="10" fill="#ffffff" stroke="#059669" stroke-width="2"/&gt;</w:t>
-        <w:br/>
-        <w:t>&lt;text x="234" y="291" text-anchor="middle" font-size="11" fill="#0f172a"&gt;Tool Use and Functi…&lt;/text&gt;</w:t>
-        <w:br/>
-        <w:t>&lt;line x1="380" y1="190" x2="143" y2="153" stroke="#94a3b8" stroke-width="2"/&gt;</w:t>
-        <w:br/>
-        <w:t>&lt;rect x="71" y="131" width="144" height="44" rx="10" fill="#ffffff" stroke="#d97706" stroke-width="2"/&gt;</w:t>
-        <w:br/>
-        <w:t>&lt;text x="143" y="157" text-anchor="middle" font-size="11" fill="#0f172a"&gt;Memory Architectures&lt;/text&gt;</w:t>
+        <w:t>&lt;svg xmlns="http://www.w3.org/2000/svg" width="760" height="380" viewBox="0 0 760 380" font-family="Inter, Segoe UI, Arial, sans-serif"&gt;</w:t>
+        <w:br/>
+        <w:t>&lt;defs&gt;&lt;marker id="arrow" markerWidth="10" markerHeight="10" refX="8" refY="3" orient="auto" markerUnits="strokeWidth"&gt;&lt;path d="M0,0 L8,3 L0,6 z" fill="#94a3b8"/&gt;&lt;/marker&gt;&lt;marker id="arrowA" markerWidth="10" markerHeight="10" refX="8" refY="3" orient="auto" markerUnits="strokeWidth"&gt;&lt;path d="M0,0 L8,3 L0,6 z" fill="#4338ca"/&gt;&lt;/marker&gt;&lt;/defs&gt;</w:t>
+        <w:br/>
+        <w:t>&lt;rect width="760" height="380" rx="12" fill="#f8fafc"/&gt;</w:t>
+        <w:br/>
+        <w:t>&lt;text x="380" y="30" text-anchor="middle" font-size="17" font-weight="700" fill="#0f172a"&gt;Business Process - Hands-On Lab: Building an End-to-End Age…&lt;/text&gt;</w:t>
+        <w:br/>
+        <w:t>&lt;rect x="40.0" y="166.0" width="104" height="60" rx="10" fill="#ffffff" stroke="#4338ca" stroke-width="2"/&gt;&lt;text x="92.0" y="200.08" text-anchor="middle" font-size="12" font-weight="600" fill="#0f172a"&gt;Intake&lt;/text&gt;</w:t>
+        <w:br/>
+        <w:t>&lt;rect x="155.2" y="166.0" width="104" height="60" rx="10" fill="#ffffff" stroke="#7c3aed" stroke-width="2"/&gt;&lt;text x="207.2" y="200.08" text-anchor="middle" font-size="12" font-weight="600" fill="#0f172a"&gt;Assess&lt;/text&gt;</w:t>
+        <w:br/>
+        <w:t>&lt;line x1="144.0" y1="196.0" x2="155.2" y2="196.0" stroke="#4338ca" stroke-width="2" marker-end="url(#arrowA)"/&gt;</w:t>
+        <w:br/>
+        <w:t>&lt;rect x="270.4" y="166.0" width="104" height="60" rx="10" fill="#ffffff" stroke="#0891b2" stroke-width="2"/&gt;&lt;text x="322.4" y="200.08" text-anchor="middle" font-size="12" font-weight="600" fill="#0f172a"&gt;Decide&lt;/text&gt;</w:t>
+        <w:br/>
+        <w:t>&lt;line x1="259.2" y1="196.0" x2="270.4" y2="196.0" stroke="#4338ca" stroke-width="2" marker-end="url(#arrowA)"/&gt;</w:t>
+        <w:br/>
+        <w:t>&lt;rect x="385.6" y="166.0" width="104" height="60" rx="10" fill="#ffffff" stroke="#059669" stroke-width="2"/&gt;&lt;text x="437.6" y="200.08" text-anchor="middle" font-size="12" font-weight="600" fill="#0f172a"&gt;Execute&lt;/text&gt;</w:t>
+        <w:br/>
+        <w:t>&lt;line x1="374.4" y1="196.0" x2="385.6" y2="196.0" stroke="#4338ca" stroke-width="2" marker-end="url(#arrowA)"/&gt;</w:t>
+        <w:br/>
+        <w:t>&lt;rect x="500.8" y="166.0" width="104" height="60" rx="10" fill="#ffffff" stroke="#d97706" stroke-width="2"/&gt;&lt;text x="552.8" y="200.08" text-anchor="middle" font-size="12" font-weight="600" fill="#0f172a"&gt;Review&lt;/text&gt;</w:t>
+        <w:br/>
+        <w:t>&lt;line x1="489.6" y1="196.0" x2="500.8" y2="196.0" stroke="#4338ca" stroke-width="2" marker-end="url(#arrowA)"/&gt;</w:t>
+        <w:br/>
+        <w:t>&lt;rect x="616.0" y="166.0" width="104" height="60" rx="10" fill="#ffffff" stroke="#dc2626" stroke-width="2"/&gt;&lt;text x="668.0" y="200.08" text-anchor="middle" font-size="12" font-weight="600" fill="#0f172a"&gt;Close&lt;/text&gt;</w:t>
+        <w:br/>
+        <w:t>&lt;line x1="604.8" y1="196.0" x2="616.0" y2="196.0" stroke="#4338ca" stroke-width="2" marker-end="url(#arrowA)"/&gt;</w:t>
+        <w:br/>
+        <w:t>&lt;path d="M668.0,226.0 q0,46 -288.0,46 q-288.0,0 -288.0,-46" fill="none" stroke="#cbd5e1" stroke-width="1.6" stroke-dasharray="5 4" marker-end="url(#arrow)"/&gt;</w:t>
+        <w:br/>
+        <w:t>&lt;text x="380.0" y="288.0" text-anchor="middle" font-size="9.5" fill="#94a3b8"&gt;feedback / monitoring loop&lt;/text&gt;</w:t>
         <w:br/>
         <w:t>&lt;/svg&gt;</w:t>
       </w:r>
@@ -13946,45 +13934,51 @@
           <w:rFonts w:ascii="Consolas" w:hAnsi="Consolas"/>
           <w:sz w:val="16"/>
         </w:rPr>
-        <w:t>&lt;svg xmlns="http://www.w3.org/2000/svg" width="760" height="360" viewBox="0 0 760 360" font-family="Inter, Arial, sans-serif"&gt;</w:t>
-        <w:br/>
-        <w:t>&lt;rect width="760" height="360" fill="#f8fafc"/&gt;</w:t>
-        <w:br/>
-        <w:t>&lt;text x="380" y="34" text-anchor="middle" font-size="20" font-weight="700" fill="#0f172a"&gt;Architecture - Case Study: Software at Scale&lt;/text&gt;</w:t>
-        <w:br/>
-        <w:t>&lt;rect x="290" y="162" width="180" height="56" rx="12" fill="#0f172a"/&gt;</w:t>
-        <w:br/>
-        <w:t>&lt;text x="380" y="195" text-anchor="middle" font-size="14" font-weight="700" fill="#ffffff"&gt;Agentic AI&lt;/text&gt;</w:t>
-        <w:br/>
-        <w:t>&lt;line x1="380" y1="190" x2="380" y2="70" stroke="#94a3b8" stroke-width="2"/&gt;</w:t>
-        <w:br/>
-        <w:t>&lt;rect x="308" y="48" width="144" height="44" rx="10" fill="#ffffff" stroke="#2563eb" stroke-width="2"/&gt;</w:t>
-        <w:br/>
-        <w:t>&lt;text x="380" y="74" text-anchor="middle" font-size="11" fill="#0f172a"&gt;From Chatbots to Ag…&lt;/text&gt;</w:t>
-        <w:br/>
-        <w:t>&lt;line x1="380" y1="190" x2="617" y2="153" stroke="#94a3b8" stroke-width="2"/&gt;</w:t>
-        <w:br/>
-        <w:t>&lt;rect x="545" y="131" width="144" height="44" rx="10" fill="#ffffff" stroke="#7c3aed" stroke-width="2"/&gt;</w:t>
-        <w:br/>
-        <w:t>&lt;text x="617" y="157" text-anchor="middle" font-size="11" fill="#0f172a"&gt;The Agent Loop: Rea…&lt;/text&gt;</w:t>
-        <w:br/>
-        <w:t>&lt;line x1="380" y1="190" x2="526" y2="287" stroke="#94a3b8" stroke-width="2"/&gt;</w:t>
-        <w:br/>
-        <w:t>&lt;rect x="454" y="265" width="144" height="44" rx="10" fill="#ffffff" stroke="#0891b2" stroke-width="2"/&gt;</w:t>
-        <w:br/>
-        <w:t>&lt;text x="526" y="291" text-anchor="middle" font-size="11" fill="#0f172a"&gt;Planning and Task D…&lt;/text&gt;</w:t>
-        <w:br/>
-        <w:t>&lt;line x1="380" y1="190" x2="234" y2="287" stroke="#94a3b8" stroke-width="2"/&gt;</w:t>
-        <w:br/>
-        <w:t>&lt;rect x="162" y="265" width="144" height="44" rx="10" fill="#ffffff" stroke="#059669" stroke-width="2"/&gt;</w:t>
-        <w:br/>
-        <w:t>&lt;text x="234" y="291" text-anchor="middle" font-size="11" fill="#0f172a"&gt;Tool Use and Functi…&lt;/text&gt;</w:t>
-        <w:br/>
-        <w:t>&lt;line x1="380" y1="190" x2="143" y2="153" stroke="#94a3b8" stroke-width="2"/&gt;</w:t>
-        <w:br/>
-        <w:t>&lt;rect x="71" y="131" width="144" height="44" rx="10" fill="#ffffff" stroke="#d97706" stroke-width="2"/&gt;</w:t>
-        <w:br/>
-        <w:t>&lt;text x="143" y="157" text-anchor="middle" font-size="11" fill="#0f172a"&gt;Memory Architectures&lt;/text&gt;</w:t>
+        <w:t>&lt;svg xmlns="http://www.w3.org/2000/svg" width="760" height="380" viewBox="0 0 760 380" font-family="Inter, Segoe UI, Arial, sans-serif"&gt;</w:t>
+        <w:br/>
+        <w:t>&lt;defs&gt;&lt;marker id="arrow" markerWidth="10" markerHeight="10" refX="8" refY="3" orient="auto" markerUnits="strokeWidth"&gt;&lt;path d="M0,0 L8,3 L0,6 z" fill="#94a3b8"/&gt;&lt;/marker&gt;&lt;marker id="arrowA" markerWidth="10" markerHeight="10" refX="8" refY="3" orient="auto" markerUnits="strokeWidth"&gt;&lt;path d="M0,0 L8,3 L0,6 z" fill="#4338ca"/&gt;&lt;/marker&gt;&lt;/defs&gt;</w:t>
+        <w:br/>
+        <w:t>&lt;rect width="760" height="380" rx="12" fill="#f8fafc"/&gt;</w:t>
+        <w:br/>
+        <w:t>&lt;text x="380" y="30" text-anchor="middle" font-size="17" font-weight="700" fill="#0f172a"&gt;Architecture - Case Study: Software at Scale&lt;/text&gt;</w:t>
+        <w:br/>
+        <w:t>&lt;rect x="30" y="48" width="700" height="96" rx="12" fill="#eef2ff" stroke="#e2e8f0"/&gt;</w:t>
+        <w:br/>
+        <w:t>&lt;text x="44" y="66" font-size="11" font-weight="700" fill="#475569"&gt;Consumers&lt;/text&gt;</w:t>
+        <w:br/>
+        <w:t>&lt;rect x="44" y="78" width="150" height="48" rx="10" fill="#ffffff" stroke="#4338ca" stroke-width="2"/&gt;&lt;text x="119.0" y="105.74" text-anchor="middle" font-size="11" font-weight="600" fill="#0f172a"&gt;Users / Apps&lt;/text&gt;</w:t>
+        <w:br/>
+        <w:t>&lt;rect x="208" y="78" width="150" height="48" rx="10" fill="#ffffff" stroke="#7c3aed" stroke-width="2"/&gt;&lt;text x="283.0" y="105.74" text-anchor="middle" font-size="11" font-weight="600" fill="#0f172a"&gt;API Clients&lt;/text&gt;</w:t>
+        <w:br/>
+        <w:t>&lt;rect x="30" y="166" width="700" height="96" rx="12" fill="#f5f3ff" stroke="#e2e8f0"/&gt;</w:t>
+        <w:br/>
+        <w:t>&lt;text x="44" y="184" font-size="11" font-weight="700" fill="#475569"&gt;Agentic AI Platform&lt;/text&gt;</w:t>
+        <w:br/>
+        <w:t>&lt;rect x="44.0" y="196" width="122.8" height="48" rx="10" fill="#ffffff" stroke="#7c3aed" stroke-width="2"/&gt;&lt;text x="105.4" y="223.74" text-anchor="middle" font-size="11" font-weight="600" fill="#0f172a"&gt;Gateway&lt;/text&gt;</w:t>
+        <w:br/>
+        <w:t>&lt;rect x="180.8" y="196" width="122.8" height="48" rx="10" fill="#ffffff" stroke="#0891b2" stroke-width="2"/&gt;&lt;text x="242.20000000000002" y="223.74" text-anchor="middle" font-size="11" font-weight="600" fill="#0f172a"&gt;From Chatbots to A…&lt;/text&gt;</w:t>
+        <w:br/>
+        <w:t>&lt;rect x="317.6" y="196" width="122.8" height="48" rx="10" fill="#ffffff" stroke="#059669" stroke-width="2"/&gt;&lt;text x="379.0" y="223.74" text-anchor="middle" font-size="11" font-weight="600" fill="#0f172a"&gt;The Agent Loop: Re…&lt;/text&gt;</w:t>
+        <w:br/>
+        <w:t>&lt;rect x="454.40000000000003" y="196" width="122.8" height="48" rx="10" fill="#ffffff" stroke="#d97706" stroke-width="2"/&gt;&lt;text x="515.8000000000001" y="223.74" text-anchor="middle" font-size="11" font-weight="600" fill="#0f172a"&gt;Planning and Task …&lt;/text&gt;</w:t>
+        <w:br/>
+        <w:t>&lt;rect x="591.2" y="196" width="122.8" height="48" rx="10" fill="#ffffff" stroke="#dc2626" stroke-width="2"/&gt;&lt;text x="652.6" y="223.74" text-anchor="middle" font-size="11" font-weight="600" fill="#0f172a"&gt;Tool Use and Funct…&lt;/text&gt;</w:t>
+        <w:br/>
+        <w:t>&lt;rect x="30" y="284" width="700" height="96" rx="12" fill="#ecfeff" stroke="#e2e8f0"/&gt;</w:t>
+        <w:br/>
+        <w:t>&lt;text x="44" y="302" font-size="11" font-weight="700" fill="#475569"&gt;Data &amp;amp; Operations&lt;/text&gt;</w:t>
+        <w:br/>
+        <w:t>&lt;rect x="44" y="314" width="150" height="48" rx="10" fill="#ffffff" stroke="#0891b2" stroke-width="2"/&gt;&lt;text x="119.0" y="341.74" text-anchor="middle" font-size="11" font-weight="600" fill="#0f172a"&gt;Primary Store&lt;/text&gt;</w:t>
+        <w:br/>
+        <w:t>&lt;rect x="208" y="314" width="150" height="48" rx="10" fill="#ffffff" stroke="#059669" stroke-width="2"/&gt;&lt;text x="283.0" y="341.74" text-anchor="middle" font-size="11" font-weight="600" fill="#0f172a"&gt;Vector Index&lt;/text&gt;</w:t>
+        <w:br/>
+        <w:t>&lt;rect x="372" y="314" width="150" height="48" rx="10" fill="#ffffff" stroke="#d97706" stroke-width="2"/&gt;&lt;text x="447.0" y="341.74" text-anchor="middle" font-size="11" font-weight="600" fill="#0f172a"&gt;Observability&lt;/text&gt;</w:t>
+        <w:br/>
+        <w:t>&lt;rect x="536" y="314" width="150" height="48" rx="10" fill="#ffffff" stroke="#dc2626" stroke-width="2"/&gt;&lt;text x="611.0" y="341.74" text-anchor="middle" font-size="11" font-weight="600" fill="#0f172a"&gt;Security&lt;/text&gt;</w:t>
+        <w:br/>
+        <w:t>&lt;line x1="380.0" y1="126" x2="380.0" y2="196" stroke="#4338ca" stroke-width="2" marker-end="url(#arrowA)"/&gt;</w:t>
+        <w:br/>
+        <w:t>&lt;line x1="380.0" y1="244" x2="380.0" y2="314" stroke="#4338ca" stroke-width="2" marker-end="url(#arrowA)"/&gt;</w:t>
         <w:br/>
         <w:t>&lt;/svg&gt;</w:t>
       </w:r>
@@ -16442,45 +16436,39 @@
           <w:rFonts w:ascii="Consolas" w:hAnsi="Consolas"/>
           <w:sz w:val="16"/>
         </w:rPr>
-        <w:t>&lt;svg xmlns="http://www.w3.org/2000/svg" width="760" height="360" viewBox="0 0 760 360" font-family="Inter, Arial, sans-serif"&gt;</w:t>
-        <w:br/>
-        <w:t>&lt;rect width="760" height="360" fill="#f8fafc"/&gt;</w:t>
-        <w:br/>
-        <w:t>&lt;text x="380" y="34" text-anchor="middle" font-size="20" font-weight="700" fill="#0f172a"&gt;RAG Architecture - Security, Privacy and Governance&lt;/text&gt;</w:t>
-        <w:br/>
-        <w:t>&lt;rect x="290" y="162" width="180" height="56" rx="12" fill="#0f172a"/&gt;</w:t>
-        <w:br/>
-        <w:t>&lt;text x="380" y="195" text-anchor="middle" font-size="14" font-weight="700" fill="#ffffff"&gt;Agentic AI&lt;/text&gt;</w:t>
-        <w:br/>
-        <w:t>&lt;line x1="380" y1="190" x2="380" y2="70" stroke="#94a3b8" stroke-width="2"/&gt;</w:t>
-        <w:br/>
-        <w:t>&lt;rect x="308" y="48" width="144" height="44" rx="10" fill="#ffffff" stroke="#2563eb" stroke-width="2"/&gt;</w:t>
-        <w:br/>
-        <w:t>&lt;text x="380" y="74" text-anchor="middle" font-size="11" fill="#0f172a"&gt;From Chatbots to Ag…&lt;/text&gt;</w:t>
-        <w:br/>
-        <w:t>&lt;line x1="380" y1="190" x2="617" y2="153" stroke="#94a3b8" stroke-width="2"/&gt;</w:t>
-        <w:br/>
-        <w:t>&lt;rect x="545" y="131" width="144" height="44" rx="10" fill="#ffffff" stroke="#7c3aed" stroke-width="2"/&gt;</w:t>
-        <w:br/>
-        <w:t>&lt;text x="617" y="157" text-anchor="middle" font-size="11" fill="#0f172a"&gt;The Agent Loop: Rea…&lt;/text&gt;</w:t>
-        <w:br/>
-        <w:t>&lt;line x1="380" y1="190" x2="526" y2="287" stroke="#94a3b8" stroke-width="2"/&gt;</w:t>
-        <w:br/>
-        <w:t>&lt;rect x="454" y="265" width="144" height="44" rx="10" fill="#ffffff" stroke="#0891b2" stroke-width="2"/&gt;</w:t>
-        <w:br/>
-        <w:t>&lt;text x="526" y="291" text-anchor="middle" font-size="11" fill="#0f172a"&gt;Planning and Task D…&lt;/text&gt;</w:t>
-        <w:br/>
-        <w:t>&lt;line x1="380" y1="190" x2="234" y2="287" stroke="#94a3b8" stroke-width="2"/&gt;</w:t>
-        <w:br/>
-        <w:t>&lt;rect x="162" y="265" width="144" height="44" rx="10" fill="#ffffff" stroke="#059669" stroke-width="2"/&gt;</w:t>
-        <w:br/>
-        <w:t>&lt;text x="234" y="291" text-anchor="middle" font-size="11" fill="#0f172a"&gt;Tool Use and Functi…&lt;/text&gt;</w:t>
-        <w:br/>
-        <w:t>&lt;line x1="380" y1="190" x2="143" y2="153" stroke="#94a3b8" stroke-width="2"/&gt;</w:t>
-        <w:br/>
-        <w:t>&lt;rect x="71" y="131" width="144" height="44" rx="10" fill="#ffffff" stroke="#d97706" stroke-width="2"/&gt;</w:t>
-        <w:br/>
-        <w:t>&lt;text x="143" y="157" text-anchor="middle" font-size="11" fill="#0f172a"&gt;Memory Architectures&lt;/text&gt;</w:t>
+        <w:t>&lt;svg xmlns="http://www.w3.org/2000/svg" width="760" height="380" viewBox="0 0 760 380" font-family="Inter, Segoe UI, Arial, sans-serif"&gt;</w:t>
+        <w:br/>
+        <w:t>&lt;defs&gt;&lt;marker id="arrow" markerWidth="10" markerHeight="10" refX="8" refY="3" orient="auto" markerUnits="strokeWidth"&gt;&lt;path d="M0,0 L8,3 L0,6 z" fill="#94a3b8"/&gt;&lt;/marker&gt;&lt;marker id="arrowA" markerWidth="10" markerHeight="10" refX="8" refY="3" orient="auto" markerUnits="strokeWidth"&gt;&lt;path d="M0,0 L8,3 L0,6 z" fill="#4338ca"/&gt;&lt;/marker&gt;&lt;/defs&gt;</w:t>
+        <w:br/>
+        <w:t>&lt;rect width="760" height="380" rx="12" fill="#f8fafc"/&gt;</w:t>
+        <w:br/>
+        <w:t>&lt;text x="380" y="30" text-anchor="middle" font-size="17" font-weight="700" fill="#0f172a"&gt;RAG Architecture - Security, Privacy and Governance&lt;/text&gt;</w:t>
+        <w:br/>
+        <w:t>&lt;rect x="40.0" y="166.0" width="104" height="60" rx="10" fill="#ffffff" stroke="#4338ca" stroke-width="2"/&gt;&lt;text x="92.0" y="200.08" text-anchor="middle" font-size="12" font-weight="600" fill="#0f172a"&gt;Query&lt;/text&gt;</w:t>
+        <w:br/>
+        <w:t>&lt;rect x="155.2" y="166.0" width="104" height="60" rx="10" fill="#ffffff" stroke="#7c3aed" stroke-width="2"/&gt;&lt;text x="207.2" y="200.08" text-anchor="middle" font-size="12" font-weight="600" fill="#0f172a"&gt;Embed&lt;/text&gt;</w:t>
+        <w:br/>
+        <w:t>&lt;line x1="144.0" y1="196.0" x2="155.2" y2="196.0" stroke="#4338ca" stroke-width="2" marker-end="url(#arrowA)"/&gt;</w:t>
+        <w:br/>
+        <w:t>&lt;rect x="270.4" y="166.0" width="104" height="60" rx="10" fill="#ffffff" stroke="#0891b2" stroke-width="2"/&gt;&lt;text x="322.4" y="200.08" text-anchor="middle" font-size="12" font-weight="600" fill="#0f172a"&gt;Retrieve&lt;/text&gt;</w:t>
+        <w:br/>
+        <w:t>&lt;line x1="259.2" y1="196.0" x2="270.4" y2="196.0" stroke="#4338ca" stroke-width="2" marker-end="url(#arrowA)"/&gt;</w:t>
+        <w:br/>
+        <w:t>&lt;rect x="385.6" y="166.0" width="104" height="60" rx="10" fill="#ffffff" stroke="#059669" stroke-width="2"/&gt;&lt;text x="437.6" y="200.08" text-anchor="middle" font-size="12" font-weight="600" fill="#0f172a"&gt;Re-rank&lt;/text&gt;</w:t>
+        <w:br/>
+        <w:t>&lt;line x1="374.4" y1="196.0" x2="385.6" y2="196.0" stroke="#4338ca" stroke-width="2" marker-end="url(#arrowA)"/&gt;</w:t>
+        <w:br/>
+        <w:t>&lt;rect x="500.8" y="166.0" width="104" height="60" rx="10" fill="#ffffff" stroke="#d97706" stroke-width="2"/&gt;&lt;text x="552.8" y="200.08" text-anchor="middle" font-size="12" font-weight="600" fill="#0f172a"&gt;Generate&lt;/text&gt;</w:t>
+        <w:br/>
+        <w:t>&lt;line x1="489.6" y1="196.0" x2="500.8" y2="196.0" stroke="#4338ca" stroke-width="2" marker-end="url(#arrowA)"/&gt;</w:t>
+        <w:br/>
+        <w:t>&lt;rect x="616.0" y="166.0" width="104" height="60" rx="10" fill="#ffffff" stroke="#dc2626" stroke-width="2"/&gt;&lt;text x="668.0" y="200.08" text-anchor="middle" font-size="12" font-weight="600" fill="#0f172a"&gt;Answer&lt;/text&gt;</w:t>
+        <w:br/>
+        <w:t>&lt;line x1="604.8" y1="196.0" x2="616.0" y2="196.0" stroke="#4338ca" stroke-width="2" marker-end="url(#arrowA)"/&gt;</w:t>
+        <w:br/>
+        <w:t>&lt;path d="M668.0,226.0 q0,46 -288.0,46 q-288.0,0 -288.0,-46" fill="none" stroke="#cbd5e1" stroke-width="1.6" stroke-dasharray="5 4" marker-end="url(#arrow)"/&gt;</w:t>
+        <w:br/>
+        <w:t>&lt;text x="380.0" y="288.0" text-anchor="middle" font-size="9.5" fill="#94a3b8"&gt;feedback / monitoring loop&lt;/text&gt;</w:t>
         <w:br/>
         <w:t>&lt;/svg&gt;</w:t>
       </w:r>
@@ -17347,45 +17335,39 @@
           <w:rFonts w:ascii="Consolas" w:hAnsi="Consolas"/>
           <w:sz w:val="16"/>
         </w:rPr>
-        <w:t>&lt;svg xmlns="http://www.w3.org/2000/svg" width="760" height="360" viewBox="0 0 760 360" font-family="Inter, Arial, sans-serif"&gt;</w:t>
-        <w:br/>
-        <w:t>&lt;rect width="760" height="360" fill="#f8fafc"/&gt;</w:t>
-        <w:br/>
-        <w:t>&lt;text x="380" y="34" text-anchor="middle" font-size="20" font-weight="700" fill="#0f172a"&gt;CI/CD Pipeline - Cost, Performance and Scaling&lt;/text&gt;</w:t>
-        <w:br/>
-        <w:t>&lt;rect x="290" y="162" width="180" height="56" rx="12" fill="#0f172a"/&gt;</w:t>
-        <w:br/>
-        <w:t>&lt;text x="380" y="195" text-anchor="middle" font-size="14" font-weight="700" fill="#ffffff"&gt;Agentic AI&lt;/text&gt;</w:t>
-        <w:br/>
-        <w:t>&lt;line x1="380" y1="190" x2="380" y2="70" stroke="#94a3b8" stroke-width="2"/&gt;</w:t>
-        <w:br/>
-        <w:t>&lt;rect x="308" y="48" width="144" height="44" rx="10" fill="#ffffff" stroke="#2563eb" stroke-width="2"/&gt;</w:t>
-        <w:br/>
-        <w:t>&lt;text x="380" y="74" text-anchor="middle" font-size="11" fill="#0f172a"&gt;From Chatbots to Ag…&lt;/text&gt;</w:t>
-        <w:br/>
-        <w:t>&lt;line x1="380" y1="190" x2="617" y2="153" stroke="#94a3b8" stroke-width="2"/&gt;</w:t>
-        <w:br/>
-        <w:t>&lt;rect x="545" y="131" width="144" height="44" rx="10" fill="#ffffff" stroke="#7c3aed" stroke-width="2"/&gt;</w:t>
-        <w:br/>
-        <w:t>&lt;text x="617" y="157" text-anchor="middle" font-size="11" fill="#0f172a"&gt;The Agent Loop: Rea…&lt;/text&gt;</w:t>
-        <w:br/>
-        <w:t>&lt;line x1="380" y1="190" x2="526" y2="287" stroke="#94a3b8" stroke-width="2"/&gt;</w:t>
-        <w:br/>
-        <w:t>&lt;rect x="454" y="265" width="144" height="44" rx="10" fill="#ffffff" stroke="#0891b2" stroke-width="2"/&gt;</w:t>
-        <w:br/>
-        <w:t>&lt;text x="526" y="291" text-anchor="middle" font-size="11" fill="#0f172a"&gt;Planning and Task D…&lt;/text&gt;</w:t>
-        <w:br/>
-        <w:t>&lt;line x1="380" y1="190" x2="234" y2="287" stroke="#94a3b8" stroke-width="2"/&gt;</w:t>
-        <w:br/>
-        <w:t>&lt;rect x="162" y="265" width="144" height="44" rx="10" fill="#ffffff" stroke="#059669" stroke-width="2"/&gt;</w:t>
-        <w:br/>
-        <w:t>&lt;text x="234" y="291" text-anchor="middle" font-size="11" fill="#0f172a"&gt;Tool Use and Functi…&lt;/text&gt;</w:t>
-        <w:br/>
-        <w:t>&lt;line x1="380" y1="190" x2="143" y2="153" stroke="#94a3b8" stroke-width="2"/&gt;</w:t>
-        <w:br/>
-        <w:t>&lt;rect x="71" y="131" width="144" height="44" rx="10" fill="#ffffff" stroke="#d97706" stroke-width="2"/&gt;</w:t>
-        <w:br/>
-        <w:t>&lt;text x="143" y="157" text-anchor="middle" font-size="11" fill="#0f172a"&gt;Memory Architectures&lt;/text&gt;</w:t>
+        <w:t>&lt;svg xmlns="http://www.w3.org/2000/svg" width="760" height="380" viewBox="0 0 760 380" font-family="Inter, Segoe UI, Arial, sans-serif"&gt;</w:t>
+        <w:br/>
+        <w:t>&lt;defs&gt;&lt;marker id="arrow" markerWidth="10" markerHeight="10" refX="8" refY="3" orient="auto" markerUnits="strokeWidth"&gt;&lt;path d="M0,0 L8,3 L0,6 z" fill="#94a3b8"/&gt;&lt;/marker&gt;&lt;marker id="arrowA" markerWidth="10" markerHeight="10" refX="8" refY="3" orient="auto" markerUnits="strokeWidth"&gt;&lt;path d="M0,0 L8,3 L0,6 z" fill="#4338ca"/&gt;&lt;/marker&gt;&lt;/defs&gt;</w:t>
+        <w:br/>
+        <w:t>&lt;rect width="760" height="380" rx="12" fill="#f8fafc"/&gt;</w:t>
+        <w:br/>
+        <w:t>&lt;text x="380" y="30" text-anchor="middle" font-size="17" font-weight="700" fill="#0f172a"&gt;CI/CD Pipeline - Cost, Performance and Scaling&lt;/text&gt;</w:t>
+        <w:br/>
+        <w:t>&lt;rect x="40.0" y="166.0" width="104" height="60" rx="10" fill="#ffffff" stroke="#4338ca" stroke-width="2"/&gt;&lt;text x="92.0" y="200.08" text-anchor="middle" font-size="12" font-weight="600" fill="#0f172a"&gt;Commit&lt;/text&gt;</w:t>
+        <w:br/>
+        <w:t>&lt;rect x="155.2" y="166.0" width="104" height="60" rx="10" fill="#ffffff" stroke="#7c3aed" stroke-width="2"/&gt;&lt;text x="207.2" y="200.08" text-anchor="middle" font-size="12" font-weight="600" fill="#0f172a"&gt;Build&lt;/text&gt;</w:t>
+        <w:br/>
+        <w:t>&lt;line x1="144.0" y1="196.0" x2="155.2" y2="196.0" stroke="#4338ca" stroke-width="2" marker-end="url(#arrowA)"/&gt;</w:t>
+        <w:br/>
+        <w:t>&lt;rect x="270.4" y="166.0" width="104" height="60" rx="10" fill="#ffffff" stroke="#0891b2" stroke-width="2"/&gt;&lt;text x="322.4" y="200.08" text-anchor="middle" font-size="12" font-weight="600" fill="#0f172a"&gt;Eval Gate&lt;/text&gt;</w:t>
+        <w:br/>
+        <w:t>&lt;line x1="259.2" y1="196.0" x2="270.4" y2="196.0" stroke="#4338ca" stroke-width="2" marker-end="url(#arrowA)"/&gt;</w:t>
+        <w:br/>
+        <w:t>&lt;rect x="385.6" y="166.0" width="104" height="60" rx="10" fill="#ffffff" stroke="#059669" stroke-width="2"/&gt;&lt;text x="437.6" y="200.08" text-anchor="middle" font-size="12" font-weight="600" fill="#0f172a"&gt;Package&lt;/text&gt;</w:t>
+        <w:br/>
+        <w:t>&lt;line x1="374.4" y1="196.0" x2="385.6" y2="196.0" stroke="#4338ca" stroke-width="2" marker-end="url(#arrowA)"/&gt;</w:t>
+        <w:br/>
+        <w:t>&lt;rect x="500.8" y="166.0" width="104" height="60" rx="10" fill="#ffffff" stroke="#d97706" stroke-width="2"/&gt;&lt;text x="552.8" y="200.08" text-anchor="middle" font-size="12" font-weight="600" fill="#0f172a"&gt;Deploy&lt;/text&gt;</w:t>
+        <w:br/>
+        <w:t>&lt;line x1="489.6" y1="196.0" x2="500.8" y2="196.0" stroke="#4338ca" stroke-width="2" marker-end="url(#arrowA)"/&gt;</w:t>
+        <w:br/>
+        <w:t>&lt;rect x="616.0" y="166.0" width="104" height="60" rx="10" fill="#ffffff" stroke="#dc2626" stroke-width="2"/&gt;&lt;text x="668.0" y="200.08" text-anchor="middle" font-size="12" font-weight="600" fill="#0f172a"&gt;Monitor&lt;/text&gt;</w:t>
+        <w:br/>
+        <w:t>&lt;line x1="604.8" y1="196.0" x2="616.0" y2="196.0" stroke="#4338ca" stroke-width="2" marker-end="url(#arrowA)"/&gt;</w:t>
+        <w:br/>
+        <w:t>&lt;path d="M668.0,226.0 q0,46 -288.0,46 q-288.0,0 -288.0,-46" fill="none" stroke="#cbd5e1" stroke-width="1.6" stroke-dasharray="5 4" marker-end="url(#arrow)"/&gt;</w:t>
+        <w:br/>
+        <w:t>&lt;text x="380.0" y="288.0" text-anchor="middle" font-size="9.5" fill="#94a3b8"&gt;feedback / monitoring loop&lt;/text&gt;</w:t>
         <w:br/>
         <w:t>&lt;/svg&gt;</w:t>
       </w:r>
@@ -18257,45 +18239,51 @@
           <w:rFonts w:ascii="Consolas" w:hAnsi="Consolas"/>
           <w:sz w:val="16"/>
         </w:rPr>
-        <w:t>&lt;svg xmlns="http://www.w3.org/2000/svg" width="760" height="360" viewBox="0 0 760 360" font-family="Inter, Arial, sans-serif"&gt;</w:t>
-        <w:br/>
-        <w:t>&lt;rect width="760" height="360" fill="#f8fafc"/&gt;</w:t>
-        <w:br/>
-        <w:t>&lt;text x="380" y="34" text-anchor="middle" font-size="20" font-weight="700" fill="#0f172a"&gt;Security Architecture - Integration and Interoperability&lt;/text&gt;</w:t>
-        <w:br/>
-        <w:t>&lt;rect x="290" y="162" width="180" height="56" rx="12" fill="#0f172a"/&gt;</w:t>
-        <w:br/>
-        <w:t>&lt;text x="380" y="195" text-anchor="middle" font-size="14" font-weight="700" fill="#ffffff"&gt;Agentic AI&lt;/text&gt;</w:t>
-        <w:br/>
-        <w:t>&lt;line x1="380" y1="190" x2="380" y2="70" stroke="#94a3b8" stroke-width="2"/&gt;</w:t>
-        <w:br/>
-        <w:t>&lt;rect x="308" y="48" width="144" height="44" rx="10" fill="#ffffff" stroke="#2563eb" stroke-width="2"/&gt;</w:t>
-        <w:br/>
-        <w:t>&lt;text x="380" y="74" text-anchor="middle" font-size="11" fill="#0f172a"&gt;From Chatbots to Ag…&lt;/text&gt;</w:t>
-        <w:br/>
-        <w:t>&lt;line x1="380" y1="190" x2="617" y2="153" stroke="#94a3b8" stroke-width="2"/&gt;</w:t>
-        <w:br/>
-        <w:t>&lt;rect x="545" y="131" width="144" height="44" rx="10" fill="#ffffff" stroke="#7c3aed" stroke-width="2"/&gt;</w:t>
-        <w:br/>
-        <w:t>&lt;text x="617" y="157" text-anchor="middle" font-size="11" fill="#0f172a"&gt;The Agent Loop: Rea…&lt;/text&gt;</w:t>
-        <w:br/>
-        <w:t>&lt;line x1="380" y1="190" x2="526" y2="287" stroke="#94a3b8" stroke-width="2"/&gt;</w:t>
-        <w:br/>
-        <w:t>&lt;rect x="454" y="265" width="144" height="44" rx="10" fill="#ffffff" stroke="#0891b2" stroke-width="2"/&gt;</w:t>
-        <w:br/>
-        <w:t>&lt;text x="526" y="291" text-anchor="middle" font-size="11" fill="#0f172a"&gt;Planning and Task D…&lt;/text&gt;</w:t>
-        <w:br/>
-        <w:t>&lt;line x1="380" y1="190" x2="234" y2="287" stroke="#94a3b8" stroke-width="2"/&gt;</w:t>
-        <w:br/>
-        <w:t>&lt;rect x="162" y="265" width="144" height="44" rx="10" fill="#ffffff" stroke="#059669" stroke-width="2"/&gt;</w:t>
-        <w:br/>
-        <w:t>&lt;text x="234" y="291" text-anchor="middle" font-size="11" fill="#0f172a"&gt;Tool Use and Functi…&lt;/text&gt;</w:t>
-        <w:br/>
-        <w:t>&lt;line x1="380" y1="190" x2="143" y2="153" stroke="#94a3b8" stroke-width="2"/&gt;</w:t>
-        <w:br/>
-        <w:t>&lt;rect x="71" y="131" width="144" height="44" rx="10" fill="#ffffff" stroke="#d97706" stroke-width="2"/&gt;</w:t>
-        <w:br/>
-        <w:t>&lt;text x="143" y="157" text-anchor="middle" font-size="11" fill="#0f172a"&gt;Memory Architectures&lt;/text&gt;</w:t>
+        <w:t>&lt;svg xmlns="http://www.w3.org/2000/svg" width="760" height="380" viewBox="0 0 760 380" font-family="Inter, Segoe UI, Arial, sans-serif"&gt;</w:t>
+        <w:br/>
+        <w:t>&lt;defs&gt;&lt;marker id="arrow" markerWidth="10" markerHeight="10" refX="8" refY="3" orient="auto" markerUnits="strokeWidth"&gt;&lt;path d="M0,0 L8,3 L0,6 z" fill="#94a3b8"/&gt;&lt;/marker&gt;&lt;marker id="arrowA" markerWidth="10" markerHeight="10" refX="8" refY="3" orient="auto" markerUnits="strokeWidth"&gt;&lt;path d="M0,0 L8,3 L0,6 z" fill="#4338ca"/&gt;&lt;/marker&gt;&lt;/defs&gt;</w:t>
+        <w:br/>
+        <w:t>&lt;rect width="760" height="380" rx="12" fill="#f8fafc"/&gt;</w:t>
+        <w:br/>
+        <w:t>&lt;text x="380" y="30" text-anchor="middle" font-size="17" font-weight="700" fill="#0f172a"&gt;Security Architecture - Integration and Interoperability&lt;/text&gt;</w:t>
+        <w:br/>
+        <w:t>&lt;rect x="30" y="48" width="700" height="96" rx="12" fill="#eef2ff" stroke="#e2e8f0"/&gt;</w:t>
+        <w:br/>
+        <w:t>&lt;text x="44" y="66" font-size="11" font-weight="700" fill="#475569"&gt;Consumers&lt;/text&gt;</w:t>
+        <w:br/>
+        <w:t>&lt;rect x="44" y="78" width="150" height="48" rx="10" fill="#ffffff" stroke="#4338ca" stroke-width="2"/&gt;&lt;text x="119.0" y="105.74" text-anchor="middle" font-size="11" font-weight="600" fill="#0f172a"&gt;Users / Apps&lt;/text&gt;</w:t>
+        <w:br/>
+        <w:t>&lt;rect x="208" y="78" width="150" height="48" rx="10" fill="#ffffff" stroke="#7c3aed" stroke-width="2"/&gt;&lt;text x="283.0" y="105.74" text-anchor="middle" font-size="11" font-weight="600" fill="#0f172a"&gt;API Clients&lt;/text&gt;</w:t>
+        <w:br/>
+        <w:t>&lt;rect x="30" y="166" width="700" height="96" rx="12" fill="#f5f3ff" stroke="#e2e8f0"/&gt;</w:t>
+        <w:br/>
+        <w:t>&lt;text x="44" y="184" font-size="11" font-weight="700" fill="#475569"&gt;Agentic AI Platform&lt;/text&gt;</w:t>
+        <w:br/>
+        <w:t>&lt;rect x="44.0" y="196" width="122.8" height="48" rx="10" fill="#ffffff" stroke="#7c3aed" stroke-width="2"/&gt;&lt;text x="105.4" y="223.74" text-anchor="middle" font-size="11" font-weight="600" fill="#0f172a"&gt;Gateway&lt;/text&gt;</w:t>
+        <w:br/>
+        <w:t>&lt;rect x="180.8" y="196" width="122.8" height="48" rx="10" fill="#ffffff" stroke="#0891b2" stroke-width="2"/&gt;&lt;text x="242.20000000000002" y="223.74" text-anchor="middle" font-size="11" font-weight="600" fill="#0f172a"&gt;From Chatbots to A…&lt;/text&gt;</w:t>
+        <w:br/>
+        <w:t>&lt;rect x="317.6" y="196" width="122.8" height="48" rx="10" fill="#ffffff" stroke="#059669" stroke-width="2"/&gt;&lt;text x="379.0" y="223.74" text-anchor="middle" font-size="11" font-weight="600" fill="#0f172a"&gt;The Agent Loop: Re…&lt;/text&gt;</w:t>
+        <w:br/>
+        <w:t>&lt;rect x="454.40000000000003" y="196" width="122.8" height="48" rx="10" fill="#ffffff" stroke="#d97706" stroke-width="2"/&gt;&lt;text x="515.8000000000001" y="223.74" text-anchor="middle" font-size="11" font-weight="600" fill="#0f172a"&gt;Planning and Task …&lt;/text&gt;</w:t>
+        <w:br/>
+        <w:t>&lt;rect x="591.2" y="196" width="122.8" height="48" rx="10" fill="#ffffff" stroke="#dc2626" stroke-width="2"/&gt;&lt;text x="652.6" y="223.74" text-anchor="middle" font-size="11" font-weight="600" fill="#0f172a"&gt;Tool Use and Funct…&lt;/text&gt;</w:t>
+        <w:br/>
+        <w:t>&lt;rect x="30" y="284" width="700" height="96" rx="12" fill="#ecfeff" stroke="#e2e8f0"/&gt;</w:t>
+        <w:br/>
+        <w:t>&lt;text x="44" y="302" font-size="11" font-weight="700" fill="#475569"&gt;Data &amp;amp; Operations&lt;/text&gt;</w:t>
+        <w:br/>
+        <w:t>&lt;rect x="44" y="314" width="150" height="48" rx="10" fill="#ffffff" stroke="#0891b2" stroke-width="2"/&gt;&lt;text x="119.0" y="341.74" text-anchor="middle" font-size="11" font-weight="600" fill="#0f172a"&gt;Primary Store&lt;/text&gt;</w:t>
+        <w:br/>
+        <w:t>&lt;rect x="208" y="314" width="150" height="48" rx="10" fill="#ffffff" stroke="#059669" stroke-width="2"/&gt;&lt;text x="283.0" y="341.74" text-anchor="middle" font-size="11" font-weight="600" fill="#0f172a"&gt;Vector Index&lt;/text&gt;</w:t>
+        <w:br/>
+        <w:t>&lt;rect x="372" y="314" width="150" height="48" rx="10" fill="#ffffff" stroke="#d97706" stroke-width="2"/&gt;&lt;text x="447.0" y="341.74" text-anchor="middle" font-size="11" font-weight="600" fill="#0f172a"&gt;Observability&lt;/text&gt;</w:t>
+        <w:br/>
+        <w:t>&lt;rect x="536" y="314" width="150" height="48" rx="10" fill="#ffffff" stroke="#dc2626" stroke-width="2"/&gt;&lt;text x="611.0" y="341.74" text-anchor="middle" font-size="11" font-weight="600" fill="#0f172a"&gt;Security&lt;/text&gt;</w:t>
+        <w:br/>
+        <w:t>&lt;line x1="380.0" y1="126" x2="380.0" y2="196" stroke="#4338ca" stroke-width="2" marker-end="url(#arrowA)"/&gt;</w:t>
+        <w:br/>
+        <w:t>&lt;line x1="380.0" y1="244" x2="380.0" y2="314" stroke="#4338ca" stroke-width="2" marker-end="url(#arrowA)"/&gt;</w:t>
         <w:br/>
         <w:t>&lt;/svg&gt;</w:t>
       </w:r>
@@ -20851,45 +20839,41 @@
           <w:rFonts w:ascii="Consolas" w:hAnsi="Consolas"/>
           <w:sz w:val="16"/>
         </w:rPr>
-        <w:t>&lt;svg xmlns="http://www.w3.org/2000/svg" width="760" height="360" viewBox="0 0 760 360" font-family="Inter, Arial, sans-serif"&gt;</w:t>
-        <w:br/>
-        <w:t>&lt;rect width="760" height="360" fill="#f8fafc"/&gt;</w:t>
-        <w:br/>
-        <w:t>&lt;text x="380" y="34" text-anchor="middle" font-size="20" font-weight="700" fill="#0f172a"&gt;Knowledge Graph - Certification Preparation and Review&lt;/text&gt;</w:t>
-        <w:br/>
-        <w:t>&lt;rect x="290" y="162" width="180" height="56" rx="12" fill="#0f172a"/&gt;</w:t>
-        <w:br/>
-        <w:t>&lt;text x="380" y="195" text-anchor="middle" font-size="14" font-weight="700" fill="#ffffff"&gt;Agentic AI&lt;/text&gt;</w:t>
-        <w:br/>
-        <w:t>&lt;line x1="380" y1="190" x2="380" y2="70" stroke="#94a3b8" stroke-width="2"/&gt;</w:t>
-        <w:br/>
-        <w:t>&lt;rect x="308" y="48" width="144" height="44" rx="10" fill="#ffffff" stroke="#2563eb" stroke-width="2"/&gt;</w:t>
-        <w:br/>
-        <w:t>&lt;text x="380" y="74" text-anchor="middle" font-size="11" fill="#0f172a"&gt;From Chatbots to Ag…&lt;/text&gt;</w:t>
-        <w:br/>
-        <w:t>&lt;line x1="380" y1="190" x2="617" y2="153" stroke="#94a3b8" stroke-width="2"/&gt;</w:t>
-        <w:br/>
-        <w:t>&lt;rect x="545" y="131" width="144" height="44" rx="10" fill="#ffffff" stroke="#7c3aed" stroke-width="2"/&gt;</w:t>
-        <w:br/>
-        <w:t>&lt;text x="617" y="157" text-anchor="middle" font-size="11" fill="#0f172a"&gt;The Agent Loop: Rea…&lt;/text&gt;</w:t>
-        <w:br/>
-        <w:t>&lt;line x1="380" y1="190" x2="526" y2="287" stroke="#94a3b8" stroke-width="2"/&gt;</w:t>
-        <w:br/>
-        <w:t>&lt;rect x="454" y="265" width="144" height="44" rx="10" fill="#ffffff" stroke="#0891b2" stroke-width="2"/&gt;</w:t>
-        <w:br/>
-        <w:t>&lt;text x="526" y="291" text-anchor="middle" font-size="11" fill="#0f172a"&gt;Planning and Task D…&lt;/text&gt;</w:t>
-        <w:br/>
-        <w:t>&lt;line x1="380" y1="190" x2="234" y2="287" stroke="#94a3b8" stroke-width="2"/&gt;</w:t>
-        <w:br/>
-        <w:t>&lt;rect x="162" y="265" width="144" height="44" rx="10" fill="#ffffff" stroke="#059669" stroke-width="2"/&gt;</w:t>
-        <w:br/>
-        <w:t>&lt;text x="234" y="291" text-anchor="middle" font-size="11" fill="#0f172a"&gt;Tool Use and Functi…&lt;/text&gt;</w:t>
-        <w:br/>
-        <w:t>&lt;line x1="380" y1="190" x2="143" y2="153" stroke="#94a3b8" stroke-width="2"/&gt;</w:t>
-        <w:br/>
-        <w:t>&lt;rect x="71" y="131" width="144" height="44" rx="10" fill="#ffffff" stroke="#d97706" stroke-width="2"/&gt;</w:t>
-        <w:br/>
-        <w:t>&lt;text x="143" y="157" text-anchor="middle" font-size="11" fill="#0f172a"&gt;Memory Architectures&lt;/text&gt;</w:t>
+        <w:t>&lt;svg xmlns="http://www.w3.org/2000/svg" width="760" height="380" viewBox="0 0 760 380" font-family="Inter, Segoe UI, Arial, sans-serif"&gt;</w:t>
+        <w:br/>
+        <w:t>&lt;defs&gt;&lt;marker id="arrow" markerWidth="10" markerHeight="10" refX="8" refY="3" orient="auto" markerUnits="strokeWidth"&gt;&lt;path d="M0,0 L8,3 L0,6 z" fill="#94a3b8"/&gt;&lt;/marker&gt;&lt;marker id="arrowA" markerWidth="10" markerHeight="10" refX="8" refY="3" orient="auto" markerUnits="strokeWidth"&gt;&lt;path d="M0,0 L8,3 L0,6 z" fill="#4338ca"/&gt;&lt;/marker&gt;&lt;/defs&gt;</w:t>
+        <w:br/>
+        <w:t>&lt;rect width="760" height="380" rx="12" fill="#f8fafc"/&gt;</w:t>
+        <w:br/>
+        <w:t>&lt;text x="380" y="30" text-anchor="middle" font-size="17" font-weight="700" fill="#0f172a"&gt;Knowledge Graph - Certification Preparation and Review&lt;/text&gt;</w:t>
+        <w:br/>
+        <w:t>&lt;circle cx="380.0" cy="198.0" r="46" fill="#0f172a"/&gt;</w:t>
+        <w:br/>
+        <w:t>&lt;text x="380.0" y="202.0" text-anchor="middle" font-size="12" font-weight="700" fill="#ffffff"&gt;Agentic AI&lt;/text&gt;</w:t>
+        <w:br/>
+        <w:t>&lt;line x1="380.0" y1="152.0" x2="380.0" y2="92.0" stroke="#94a3b8" stroke-width="2" marker-end="url(#arrow)"/&gt;</w:t>
+        <w:br/>
+        <w:t>&lt;rect x="306.0" y="58.0" width="148" height="44" rx="10" fill="#ffffff" stroke="#4338ca" stroke-width="2"/&gt;&lt;text x="380.0" y="83.74" text-anchor="middle" font-size="11" font-weight="600" fill="#0f172a"&gt;From Chatbots to Agents&lt;/text&gt;</w:t>
+        <w:br/>
+        <w:t>&lt;line x1="419.83716857408416" y1="175.0" x2="575.7217412552832" y2="145.0" stroke="#94a3b8" stroke-width="2" marker-end="url(#arrow)"/&gt;</w:t>
+        <w:br/>
+        <w:t>&lt;rect x="522.5063509461097" y="117.0" width="148" height="44" rx="10" fill="#ffffff" stroke="#7c3aed" stroke-width="2"/&gt;&lt;text x="596.5063509461097" y="142.74" text-anchor="middle" font-size="11" font-weight="600" fill="#0f172a"&gt;The Agent Loop: Reason,…&lt;/text&gt;</w:t>
+        <w:br/>
+        <w:t>&lt;line x1="419.83716857408416" y1="221.0" x2="575.7217412552832" y2="251.0" stroke="#94a3b8" stroke-width="2" marker-end="url(#arrow)"/&gt;</w:t>
+        <w:br/>
+        <w:t>&lt;rect x="522.5063509461097" y="235.0" width="148" height="44" rx="10" fill="#ffffff" stroke="#0891b2" stroke-width="2"/&gt;&lt;text x="596.5063509461097" y="260.74" text-anchor="middle" font-size="11" font-weight="600" fill="#0f172a"&gt;Planning and Task Decom…&lt;/text&gt;</w:t>
+        <w:br/>
+        <w:t>&lt;line x1="380.0" y1="244.0" x2="380.0" y2="304.0" stroke="#94a3b8" stroke-width="2" marker-end="url(#arrow)"/&gt;</w:t>
+        <w:br/>
+        <w:t>&lt;rect x="306.0" y="294.0" width="148" height="44" rx="10" fill="#ffffff" stroke="#059669" stroke-width="2"/&gt;&lt;text x="380.0" y="319.74" text-anchor="middle" font-size="11" font-weight="600" fill="#0f172a"&gt;Tool Use and Function C…&lt;/text&gt;</w:t>
+        <w:br/>
+        <w:t>&lt;line x1="340.16283142591584" y1="221.0" x2="184.2782587447169" y2="251.00000000000006" stroke="#94a3b8" stroke-width="2" marker-end="url(#arrow)"/&gt;</w:t>
+        <w:br/>
+        <w:t>&lt;rect x="89.49364905389038" y="235.00000000000006" width="148" height="44" rx="10" fill="#ffffff" stroke="#d97706" stroke-width="2"/&gt;&lt;text x="163.49364905389038" y="260.74000000000007" text-anchor="middle" font-size="11" font-weight="600" fill="#0f172a"&gt;Memory Architectures&lt;/text&gt;</w:t>
+        <w:br/>
+        <w:t>&lt;line x1="340.16283142591584" y1="175.0" x2="184.27825874471688" y2="145.0" stroke="#94a3b8" stroke-width="2" marker-end="url(#arrow)"/&gt;</w:t>
+        <w:br/>
+        <w:t>&lt;rect x="89.49364905389035" y="117.0" width="148" height="44" rx="10" fill="#ffffff" stroke="#dc2626" stroke-width="2"/&gt;&lt;text x="163.49364905389035" y="142.74" text-anchor="middle" font-size="11" font-weight="600" fill="#0f172a"&gt;Reflection and Self-Cor…&lt;/text&gt;</w:t>
         <w:br/>
         <w:t>&lt;/svg&gt;</w:t>
       </w:r>

</xml_diff>

<commit_message>
Complete diagram text, scroll-to-top on chapter change, animated walkthrough
- Diagrams: replace truncation with full word-wrapping (multi-line labels) so
  node text is always complete (verified 0 ellipses across all domains/kinds);
  removed pre-truncation in box/tree/radial/grid/pillars/ladder labels.
- Reader: jump to top of page instantly when changing chapters.
- Each chapter now opens with an auto-playing looping 'animated walkthrough'
  (SVG/SMIL explainer: Problem -> Approach -> Design -> Build -> Evaluate ->
  Operate, with moving highlight + progress bar) plus a 'Watch real-world
  videos' link that opens curated YouTube results for the chapter topic.
- Regenerated the 12-book demo corpus.

Co-authored-by: ankit05121980 <ankit05121980@users.noreply.github.com>
</commit_message>
<xml_diff>
--- a/content/agentic-ai/agentic-ai-foundations/agentic-ai-foundations.docx
+++ b/content/agentic-ai/agentic-ai-foundations/agentic-ai-foundations.docx
@@ -8038,7 +8038,7 @@
           <w:rFonts w:ascii="Consolas" w:hAnsi="Consolas"/>
           <w:sz w:val="16"/>
         </w:rPr>
-        <w:t>&lt;svg xmlns="http://www.w3.org/2000/svg" width="840" height="460" data-tpl="grid_matrix" data-pal="0-4" viewBox="0 0 840 460" font-family="Inter, Segoe UI, Arial, sans-serif"&gt;&lt;defs&gt;&lt;marker id="ar" markerWidth="9" markerHeight="9" refX="7" refY="3" orient="auto"&gt;&lt;path d="M0,0 L7,3 L0,6 z" fill="#94a3b8"/&gt;&lt;/marker&gt;&lt;marker id="arw" markerWidth="9" markerHeight="9" refX="7" refY="3" orient="auto"&gt;&lt;path d="M0,0 L7,3 L0,6 z" fill="#ffffff"/&gt;&lt;/marker&gt;&lt;filter id="sh" x="-20%" y="-20%" width="140%" height="140%"&gt;&lt;feDropShadow dx="0" dy="2" stdDeviation="3" flood-color="#0f172a" flood-opacity="0.16"/&gt;&lt;/filter&gt;&lt;/defs&gt;&lt;defs&gt;&lt;linearGradient id="bnd556f02" x1="0" y1="0" x2="1" y2="0"&gt;&lt;stop offset="0" stop-color="#a78bfa"/&gt;&lt;stop offset="1" stop-color="#c4b5fd"/&gt;&lt;/linearGradient&gt;&lt;/defs&gt;&lt;rect width="840" height="460" rx="14" fill="#ffffff"/&gt;&lt;rect x="0" y="0" width="840" height="48" rx="14" fill="url(#bnd556f02)"/&gt;&lt;rect x="0" y="32" width="840" height="16" fill="url(#bnd556f02)"/&gt;&lt;text x="420" y="25" text-anchor="middle" font-size="15" font-weight="700" fill="#ffffff" dominant-baseline="middle"&gt;Operating Model - Cost, Latency and Loop Control&lt;/text&gt;&lt;text x="276" y="78" text-anchor="middle" font-size="10.5" font-weight="700" fill="#64748b" dominant-baseline="middle"&gt;Plan&lt;/text&gt;&lt;text x="430" y="78" text-anchor="middle" font-size="10.5" font-weight="700" fill="#64748b" dominant-baseline="middle"&gt;Build&lt;/text&gt;&lt;text x="582" y="78" text-anchor="middle" font-size="10.5" font-weight="700" fill="#64748b" dominant-baseline="middle"&gt;Run&lt;/text&gt;&lt;text x="736" y="78" text-anchor="middle" font-size="10.5" font-weight="700" fill="#64748b" dominant-baseline="middle"&gt;Improve&lt;/text&gt;&lt;text x="188" y="125" text-anchor="end" font-size="10.5" font-weight="600" fill="#0f172a" dominant-baseline="middle"&gt;Safety, Sandboxing an…&lt;/text&gt;&lt;rect x="203" y="93" width="147" height="64" rx="8" fill="#a78bfa"/&gt;&lt;rect x="203" y="93" width="147" height="64" rx="8" fill="#ffffff" fill-opacity="0.62"/&gt;&lt;rect x="356" y="93" width="147" height="64" rx="8" fill="#c4b5fd"/&gt;&lt;rect x="356" y="93" width="147" height="64" rx="8" fill="#ffffff" fill-opacity="0.00"/&gt;&lt;rect x="509" y="93" width="147" height="64" rx="8" fill="#4338ca"/&gt;&lt;rect x="509" y="93" width="147" height="64" rx="8" fill="#ffffff" fill-opacity="0.62"/&gt;&lt;rect x="662" y="93" width="147" height="64" rx="8" fill="#6d28d9"/&gt;&lt;rect x="662" y="93" width="147" height="64" rx="8" fill="#ffffff" fill-opacity="0.25"/&gt;&lt;text x="188" y="195" text-anchor="end" font-size="10.5" font-weight="600" fill="#0f172a" dominant-baseline="middle"&gt;Cost, Latency and Loo…&lt;/text&gt;&lt;rect x="203" y="163" width="147" height="64" rx="8" fill="#c4b5fd"/&gt;&lt;rect x="203" y="163" width="147" height="64" rx="8" fill="#ffffff" fill-opacity="0.00"/&gt;&lt;rect x="356" y="163" width="147" height="64" rx="8" fill="#4338ca"/&gt;&lt;rect x="356" y="163" width="147" height="64" rx="8" fill="#ffffff" fill-opacity="0.62"/&gt;&lt;rect x="509" y="163" width="147" height="64" rx="8" fill="#6d28d9"/&gt;&lt;rect x="509" y="163" width="147" height="64" rx="8" fill="#ffffff" fill-opacity="0.25"/&gt;&lt;rect x="662" y="163" width="147" height="64" rx="8" fill="#7c3aed"/&gt;&lt;rect x="662" y="163" width="147" height="64" rx="8" fill="#ffffff" fill-opacity="0.25"/&gt;&lt;text x="188" y="265" text-anchor="end" font-size="10.5" font-weight="600" fill="#0f172a" dominant-baseline="middle"&gt;Evaluating Agents&lt;/text&gt;&lt;rect x="203" y="233" width="147" height="64" rx="8" fill="#4338ca"/&gt;&lt;rect x="203" y="233" width="147" height="64" rx="8" fill="#ffffff" fill-opacity="0.12"/&gt;&lt;rect x="356" y="233" width="147" height="64" rx="8" fill="#6d28d9"/&gt;&lt;rect x="356" y="233" width="147" height="64" rx="8" fill="#ffffff" fill-opacity="0.12"/&gt;&lt;rect x="509" y="233" width="147" height="64" rx="8" fill="#7c3aed"/&gt;&lt;rect x="509" y="233" width="147" height="64" rx="8" fill="#ffffff" fill-opacity="0.62"/&gt;&lt;rect x="662" y="233" width="147" height="64" rx="8" fill="#8b5cf6"/&gt;&lt;rect x="662" y="233" width="147" height="64" rx="8" fill="#ffffff" fill-opacity="0.50"/&gt;&lt;text x="188" y="335" text-anchor="end" font-size="10.5" font-weight="600" fill="#0f172a" dominant-baseline="middle"&gt;Agent Frameworks and …&lt;/text&gt;&lt;rect x="203" y="303" width="147" height="64" rx="8" fill="#6d28d9"/&gt;&lt;rect x="203" y="303" width="147" height="64" rx="8" fill="#ffffff" fill-opacity="0.12"/&gt;&lt;rect x="356" y="303" width="147" height="64" rx="8" fill="#7c3aed"/&gt;&lt;rect x="356" y="303" width="147" height="64" rx="8" fill="#ffffff" fill-opacity="0.12"/&gt;&lt;rect x="509" y="303" width="147" height="64" rx="8" fill="#8b5cf6"/&gt;&lt;rect x="509" y="303" width="147" height="64" rx="8" fill="#ffffff" fill-opacity="0.25"/&gt;&lt;rect x="662" y="303" width="147" height="64" rx="8" fill="#a78bfa"/&gt;&lt;rect x="662" y="303" width="147" height="64" rx="8" fill="#ffffff" fill-opacity="0.12"/&gt;&lt;text x="28" y="446" text-anchor="start" font-size="9.5" font-weight="500" fill="#64748b" dominant-baseline="middle"&gt;Agentic AI  •  Operating Model&lt;/text&gt;&lt;/svg&gt;</w:t>
+        <w:t>&lt;svg xmlns="http://www.w3.org/2000/svg" width="840" height="460" data-tpl="grid_matrix" data-pal="0-4" viewBox="0 0 840 460" font-family="Inter, Segoe UI, Arial, sans-serif"&gt;&lt;defs&gt;&lt;marker id="ar" markerWidth="9" markerHeight="9" refX="7" refY="3" orient="auto"&gt;&lt;path d="M0,0 L7,3 L0,6 z" fill="#94a3b8"/&gt;&lt;/marker&gt;&lt;marker id="arw" markerWidth="9" markerHeight="9" refX="7" refY="3" orient="auto"&gt;&lt;path d="M0,0 L7,3 L0,6 z" fill="#ffffff"/&gt;&lt;/marker&gt;&lt;filter id="sh" x="-20%" y="-20%" width="140%" height="140%"&gt;&lt;feDropShadow dx="0" dy="2" stdDeviation="3" flood-color="#0f172a" flood-opacity="0.16"/&gt;&lt;/filter&gt;&lt;/defs&gt;&lt;defs&gt;&lt;linearGradient id="bnd556f02" x1="0" y1="0" x2="1" y2="0"&gt;&lt;stop offset="0" stop-color="#a78bfa"/&gt;&lt;stop offset="1" stop-color="#c4b5fd"/&gt;&lt;/linearGradient&gt;&lt;/defs&gt;&lt;rect width="840" height="460" rx="14" fill="#ffffff"/&gt;&lt;rect x="0" y="0" width="840" height="48" rx="14" fill="url(#bnd556f02)"/&gt;&lt;rect x="0" y="32" width="840" height="16" fill="url(#bnd556f02)"/&gt;&lt;text x="420" y="25" text-anchor="middle" font-size="14.5" font-weight="700" fill="#ffffff" dominant-baseline="middle"&gt;Operating Model - Cost, Latency and Loop Control&lt;/text&gt;&lt;text x="276" y="78" text-anchor="middle" font-size="10.5" font-weight="700" fill="#64748b" dominant-baseline="middle"&gt;Plan&lt;/text&gt;&lt;text x="430" y="78" text-anchor="middle" font-size="10.5" font-weight="700" fill="#64748b" dominant-baseline="middle"&gt;Build&lt;/text&gt;&lt;text x="582" y="78" text-anchor="middle" font-size="10.5" font-weight="700" fill="#64748b" dominant-baseline="middle"&gt;Run&lt;/text&gt;&lt;text x="736" y="78" text-anchor="middle" font-size="10.5" font-weight="700" fill="#64748b" dominant-baseline="middle"&gt;Improve&lt;/text&gt;&lt;text x="188" y="119" text-anchor="end" font-size="10" font-weight="600" fill="#0f172a" dominant-baseline="middle"&gt;Safety, Sandboxing and&lt;/text&gt;&lt;text x="188" y="131" text-anchor="end" font-size="10" font-weight="600" fill="#0f172a" dominant-baseline="middle"&gt;Permissions&lt;/text&gt;&lt;rect x="203" y="93" width="147" height="64" rx="8" fill="#a78bfa"/&gt;&lt;rect x="203" y="93" width="147" height="64" rx="8" fill="#ffffff" fill-opacity="0.62"/&gt;&lt;rect x="356" y="93" width="147" height="64" rx="8" fill="#c4b5fd"/&gt;&lt;rect x="356" y="93" width="147" height="64" rx="8" fill="#ffffff" fill-opacity="0.00"/&gt;&lt;rect x="509" y="93" width="147" height="64" rx="8" fill="#4338ca"/&gt;&lt;rect x="509" y="93" width="147" height="64" rx="8" fill="#ffffff" fill-opacity="0.62"/&gt;&lt;rect x="662" y="93" width="147" height="64" rx="8" fill="#6d28d9"/&gt;&lt;rect x="662" y="93" width="147" height="64" rx="8" fill="#ffffff" fill-opacity="0.25"/&gt;&lt;text x="188" y="189" text-anchor="end" font-size="10" font-weight="600" fill="#0f172a" dominant-baseline="middle"&gt;Cost, Latency and Loop&lt;/text&gt;&lt;text x="188" y="201" text-anchor="end" font-size="10" font-weight="600" fill="#0f172a" dominant-baseline="middle"&gt;Control&lt;/text&gt;&lt;rect x="203" y="163" width="147" height="64" rx="8" fill="#c4b5fd"/&gt;&lt;rect x="203" y="163" width="147" height="64" rx="8" fill="#ffffff" fill-opacity="0.00"/&gt;&lt;rect x="356" y="163" width="147" height="64" rx="8" fill="#4338ca"/&gt;&lt;rect x="356" y="163" width="147" height="64" rx="8" fill="#ffffff" fill-opacity="0.62"/&gt;&lt;rect x="509" y="163" width="147" height="64" rx="8" fill="#6d28d9"/&gt;&lt;rect x="509" y="163" width="147" height="64" rx="8" fill="#ffffff" fill-opacity="0.25"/&gt;&lt;rect x="662" y="163" width="147" height="64" rx="8" fill="#7c3aed"/&gt;&lt;rect x="662" y="163" width="147" height="64" rx="8" fill="#ffffff" fill-opacity="0.25"/&gt;&lt;text x="188" y="265" text-anchor="end" font-size="10" font-weight="600" fill="#0f172a" dominant-baseline="middle"&gt;Evaluating Agents&lt;/text&gt;&lt;rect x="203" y="233" width="147" height="64" rx="8" fill="#4338ca"/&gt;&lt;rect x="203" y="233" width="147" height="64" rx="8" fill="#ffffff" fill-opacity="0.12"/&gt;&lt;rect x="356" y="233" width="147" height="64" rx="8" fill="#6d28d9"/&gt;&lt;rect x="356" y="233" width="147" height="64" rx="8" fill="#ffffff" fill-opacity="0.12"/&gt;&lt;rect x="509" y="233" width="147" height="64" rx="8" fill="#7c3aed"/&gt;&lt;rect x="509" y="233" width="147" height="64" rx="8" fill="#ffffff" fill-opacity="0.62"/&gt;&lt;rect x="662" y="233" width="147" height="64" rx="8" fill="#8b5cf6"/&gt;&lt;rect x="662" y="233" width="147" height="64" rx="8" fill="#ffffff" fill-opacity="0.50"/&gt;&lt;text x="188" y="329" text-anchor="end" font-size="10" font-weight="600" fill="#0f172a" dominant-baseline="middle"&gt;Agent Frameworks and&lt;/text&gt;&lt;text x="188" y="341" text-anchor="end" font-size="10" font-weight="600" fill="#0f172a" dominant-baseline="middle"&gt;Patterns&lt;/text&gt;&lt;rect x="203" y="303" width="147" height="64" rx="8" fill="#6d28d9"/&gt;&lt;rect x="203" y="303" width="147" height="64" rx="8" fill="#ffffff" fill-opacity="0.12"/&gt;&lt;rect x="356" y="303" width="147" height="64" rx="8" fill="#7c3aed"/&gt;&lt;rect x="356" y="303" width="147" height="64" rx="8" fill="#ffffff" fill-opacity="0.12"/&gt;&lt;rect x="509" y="303" width="147" height="64" rx="8" fill="#8b5cf6"/&gt;&lt;rect x="509" y="303" width="147" height="64" rx="8" fill="#ffffff" fill-opacity="0.25"/&gt;&lt;rect x="662" y="303" width="147" height="64" rx="8" fill="#a78bfa"/&gt;&lt;rect x="662" y="303" width="147" height="64" rx="8" fill="#ffffff" fill-opacity="0.12"/&gt;&lt;text x="28" y="446" text-anchor="start" font-size="9.5" font-weight="500" fill="#64748b" dominant-baseline="middle"&gt;Agentic AI  •  Operating Model&lt;/text&gt;&lt;/svg&gt;</w:t>
       </w:r>
     </w:p>
     <w:p>
@@ -8841,7 +8841,7 @@
           <w:rFonts w:ascii="Consolas" w:hAnsi="Consolas"/>
           <w:sz w:val="16"/>
         </w:rPr>
-        <w:t>&lt;svg xmlns="http://www.w3.org/2000/svg" width="840" height="460" data-tpl="flow_h" data-pal="4-2" viewBox="0 0 840 460" font-family="Inter, Segoe UI, Arial, sans-serif"&gt;&lt;defs&gt;&lt;marker id="ar" markerWidth="9" markerHeight="9" refX="7" refY="3" orient="auto"&gt;&lt;path d="M0,0 L7,3 L0,6 z" fill="#94a3b8"/&gt;&lt;/marker&gt;&lt;marker id="arw" markerWidth="9" markerHeight="9" refX="7" refY="3" orient="auto"&gt;&lt;path d="M0,0 L7,3 L0,6 z" fill="#ffffff"/&gt;&lt;/marker&gt;&lt;filter id="sh" x="-20%" y="-20%" width="140%" height="140%"&gt;&lt;feDropShadow dx="0" dy="2" stdDeviation="3" flood-color="#0f172a" flood-opacity="0.16"/&gt;&lt;/filter&gt;&lt;/defs&gt;&lt;defs&gt;&lt;linearGradient id="bn8122589" x1="0" y1="0" x2="1" y2="0"&gt;&lt;stop offset="0" stop-color="#e11d48"/&gt;&lt;stop offset="1" stop-color="#f43f5e"/&gt;&lt;/linearGradient&gt;&lt;/defs&gt;&lt;rect width="840" height="460" rx="14" fill="#ffffff"/&gt;&lt;rect x="0" y="0" width="840" height="48" rx="14" fill="url(#bn8122589)"/&gt;&lt;rect x="0" y="32" width="840" height="16" fill="url(#bn8122589)"/&gt;&lt;text x="420" y="25" text-anchor="middle" font-size="15" font-weight="700" fill="#ffffff" dominant-baseline="middle"&gt;Application Flow - Evaluating Agents&lt;/text&gt;&lt;rect x="39" y="196" width="130" height="68" rx="11" fill="#e11d48" filter="url(#sh)"/&gt;&lt;text x="104" y="230" text-anchor="middle" font-size="12" font-weight="600" fill="#ffffff" dominant-baseline="middle"&gt;Tool Use and Funct…&lt;/text&gt;&lt;rect x="197" y="196" width="130" height="68" rx="11" fill="#f43f5e" filter="url(#sh)"/&gt;&lt;text x="262" y="230" text-anchor="middle" font-size="12" font-weight="600" fill="#ffffff" dominant-baseline="middle"&gt;Memory Architectur…&lt;/text&gt;&lt;line x1="169" y1="230" x2="197" y2="230" stroke="#94a3b8" stroke-width="2" marker-end="url(#ar)"/&gt;&lt;rect x="355" y="196" width="130" height="68" rx="11" fill="#fb7185" filter="url(#sh)"/&gt;&lt;text x="420" y="230" text-anchor="middle" font-size="12" font-weight="600" fill="#ffffff" dominant-baseline="middle"&gt;Reflection and Sel…&lt;/text&gt;&lt;line x1="327" y1="230" x2="355" y2="230" stroke="#94a3b8" stroke-width="2" marker-end="url(#ar)"/&gt;&lt;rect x="513" y="196" width="130" height="68" rx="11" fill="#db2777" filter="url(#sh)"/&gt;&lt;text x="578" y="230" text-anchor="middle" font-size="12" font-weight="600" fill="#ffffff" dominant-baseline="middle"&gt;Grounding and Retr…&lt;/text&gt;&lt;line x1="485" y1="230" x2="513" y2="230" stroke="#94a3b8" stroke-width="2" marker-end="url(#ar)"/&gt;&lt;rect x="671" y="196" width="130" height="68" rx="11" fill="#9f1239" filter="url(#sh)"/&gt;&lt;text x="736" y="230" text-anchor="middle" font-size="12" font-weight="600" fill="#ffffff" dominant-baseline="middle"&gt;Human-in-the-Loop …&lt;/text&gt;&lt;line x1="643" y1="230" x2="671" y2="230" stroke="#94a3b8" stroke-width="2" marker-end="url(#ar)"/&gt;&lt;text x="420" y="300" text-anchor="middle" font-size="11" font-weight="500" fill="#64748b" dominant-baseline="middle"&gt;end-to-end flow&lt;/text&gt;&lt;text x="28" y="446" text-anchor="start" font-size="9.5" font-weight="500" fill="#64748b" dominant-baseline="middle"&gt;Agentic AI  •  Application Flow&lt;/text&gt;&lt;/svg&gt;</w:t>
+        <w:t>&lt;svg xmlns="http://www.w3.org/2000/svg" width="840" height="460" data-tpl="flow_h" data-pal="4-2" viewBox="0 0 840 460" font-family="Inter, Segoe UI, Arial, sans-serif"&gt;&lt;defs&gt;&lt;marker id="ar" markerWidth="9" markerHeight="9" refX="7" refY="3" orient="auto"&gt;&lt;path d="M0,0 L7,3 L0,6 z" fill="#94a3b8"/&gt;&lt;/marker&gt;&lt;marker id="arw" markerWidth="9" markerHeight="9" refX="7" refY="3" orient="auto"&gt;&lt;path d="M0,0 L7,3 L0,6 z" fill="#ffffff"/&gt;&lt;/marker&gt;&lt;filter id="sh" x="-20%" y="-20%" width="140%" height="140%"&gt;&lt;feDropShadow dx="0" dy="2" stdDeviation="3" flood-color="#0f172a" flood-opacity="0.16"/&gt;&lt;/filter&gt;&lt;/defs&gt;&lt;defs&gt;&lt;linearGradient id="bn8122589" x1="0" y1="0" x2="1" y2="0"&gt;&lt;stop offset="0" stop-color="#e11d48"/&gt;&lt;stop offset="1" stop-color="#f43f5e"/&gt;&lt;/linearGradient&gt;&lt;/defs&gt;&lt;rect width="840" height="460" rx="14" fill="#ffffff"/&gt;&lt;rect x="0" y="0" width="840" height="48" rx="14" fill="url(#bn8122589)"/&gt;&lt;rect x="0" y="32" width="840" height="16" fill="url(#bn8122589)"/&gt;&lt;text x="420" y="25" text-anchor="middle" font-size="14.5" font-weight="700" fill="#ffffff" dominant-baseline="middle"&gt;Application Flow - Evaluating Agents&lt;/text&gt;&lt;rect x="39" y="196" width="130" height="68" rx="11" fill="#e11d48" filter="url(#sh)"/&gt;&lt;text x="104" y="224" text-anchor="middle" font-size="10.5" font-weight="600" fill="#ffffff" dominant-baseline="middle"&gt;Tool Use and Function&lt;/text&gt;&lt;text x="104" y="236" text-anchor="middle" font-size="10.5" font-weight="600" fill="#ffffff" dominant-baseline="middle"&gt;Calling&lt;/text&gt;&lt;rect x="197" y="196" width="130" height="68" rx="11" fill="#f43f5e" filter="url(#sh)"/&gt;&lt;text x="262" y="230" text-anchor="middle" font-size="10.5" font-weight="600" fill="#ffffff" dominant-baseline="middle"&gt;Memory Architectures&lt;/text&gt;&lt;line x1="169" y1="230" x2="197" y2="230" stroke="#94a3b8" stroke-width="2" marker-end="url(#ar)"/&gt;&lt;rect x="355" y="196" width="130" height="68" rx="11" fill="#fb7185" filter="url(#sh)"/&gt;&lt;text x="420" y="224" text-anchor="middle" font-size="10.5" font-weight="600" fill="#ffffff" dominant-baseline="middle"&gt;Reflection and&lt;/text&gt;&lt;text x="420" y="236" text-anchor="middle" font-size="10.5" font-weight="600" fill="#ffffff" dominant-baseline="middle"&gt;Self-Correction&lt;/text&gt;&lt;line x1="327" y1="230" x2="355" y2="230" stroke="#94a3b8" stroke-width="2" marker-end="url(#ar)"/&gt;&lt;rect x="513" y="196" width="130" height="68" rx="11" fill="#db2777" filter="url(#sh)"/&gt;&lt;text x="578" y="224" text-anchor="middle" font-size="10.5" font-weight="600" fill="#ffffff" dominant-baseline="middle"&gt;Grounding and&lt;/text&gt;&lt;text x="578" y="236" text-anchor="middle" font-size="10.5" font-weight="600" fill="#ffffff" dominant-baseline="middle"&gt;Retrieval for Agents&lt;/text&gt;&lt;line x1="485" y1="230" x2="513" y2="230" stroke="#94a3b8" stroke-width="2" marker-end="url(#ar)"/&gt;&lt;rect x="671" y="196" width="130" height="68" rx="11" fill="#9f1239" filter="url(#sh)"/&gt;&lt;text x="736" y="224" text-anchor="middle" font-size="10.5" font-weight="600" fill="#ffffff" dominant-baseline="middle"&gt;Human-in-the-Loop and&lt;/text&gt;&lt;text x="736" y="236" text-anchor="middle" font-size="10.5" font-weight="600" fill="#ffffff" dominant-baseline="middle"&gt;Approvals&lt;/text&gt;&lt;line x1="643" y1="230" x2="671" y2="230" stroke="#94a3b8" stroke-width="2" marker-end="url(#ar)"/&gt;&lt;text x="420" y="300" text-anchor="middle" font-size="11" font-weight="500" fill="#64748b" dominant-baseline="middle"&gt;end-to-end flow&lt;/text&gt;&lt;text x="28" y="446" text-anchor="start" font-size="9.5" font-weight="500" fill="#64748b" dominant-baseline="middle"&gt;Agentic AI  •  Application Flow&lt;/text&gt;&lt;/svg&gt;</w:t>
       </w:r>
     </w:p>
     <w:p>
@@ -10439,7 +10439,7 @@
           <w:rFonts w:ascii="Consolas" w:hAnsi="Consolas"/>
           <w:sz w:val="16"/>
         </w:rPr>
-        <w:t>&lt;svg xmlns="http://www.w3.org/2000/svg" width="840" height="460" data-tpl="tree" data-pal="11-2" viewBox="0 0 840 460" font-family="Inter, Segoe UI, Arial, sans-serif"&gt;&lt;defs&gt;&lt;marker id="ar" markerWidth="9" markerHeight="9" refX="7" refY="3" orient="auto"&gt;&lt;path d="M0,0 L7,3 L0,6 z" fill="#94a3b8"/&gt;&lt;/marker&gt;&lt;marker id="arw" markerWidth="9" markerHeight="9" refX="7" refY="3" orient="auto"&gt;&lt;path d="M0,0 L7,3 L0,6 z" fill="#ffffff"/&gt;&lt;/marker&gt;&lt;filter id="sh" x="-20%" y="-20%" width="140%" height="140%"&gt;&lt;feDropShadow dx="0" dy="2" stdDeviation="3" flood-color="#0f172a" flood-opacity="0.16"/&gt;&lt;/filter&gt;&lt;/defs&gt;&lt;defs&gt;&lt;linearGradient id="bn2a0c45" x1="0" y1="0" x2="1" y2="0"&gt;&lt;stop offset="0" stop-color="#0e7490"/&gt;&lt;stop offset="1" stop-color="#b45309"/&gt;&lt;/linearGradient&gt;&lt;/defs&gt;&lt;rect width="840" height="460" rx="14" fill="#ffffff"/&gt;&lt;rect x="0" y="0" width="840" height="48" rx="14" fill="url(#bn2a0c45)"/&gt;&lt;rect x="0" y="32" width="840" height="16" fill="url(#bn2a0c45)"/&gt;&lt;text x="420" y="25" text-anchor="middle" font-size="15" font-weight="700" fill="#ffffff" dominant-baseline="middle"&gt;Data Lineage - Observability for Agents&lt;/text&gt;&lt;rect x="330" y="70" width="180" height="48" rx="11" fill="#0f172a" filter="url(#sh)"/&gt;&lt;text x="420" y="94" text-anchor="middle" font-size="12" font-weight="600" fill="#ffffff" dominant-baseline="middle"&gt;Agentic AI&lt;/text&gt;&lt;path d="M420,118 C420,170 108,160 108,210" fill="none" stroke="#cbd5e1" stroke-width="2"/&gt;&lt;rect x="30" y="210" width="156" height="46" rx="11" fill="#0e7490" filter="url(#sh)"/&gt;&lt;text x="108" y="233" text-anchor="middle" font-size="11" font-weight="600" fill="#ffffff" dominant-baseline="middle"&gt;The Agent Loop: Reason, …&lt;/text&gt;&lt;line x1="108" y1="256" x2="108" y2="296" stroke="#cbd5e1" stroke-width="1.6"/&gt;&lt;rect x="38" y="296" width="140" height="40" rx="11" fill="#f8fafc" filter="url(#sh)"/&gt;&lt;text x="108" y="316" text-anchor="middle" font-size="10" font-weight="600" fill="#0f172a" dominant-baseline="middle"&gt;Planning and Ta…&lt;/text&gt;&lt;path d="M420,118 C420,170 316,160 316,210" fill="none" stroke="#cbd5e1" stroke-width="2"/&gt;&lt;rect x="238" y="210" width="156" height="46" rx="11" fill="#b45309" filter="url(#sh)"/&gt;&lt;text x="316" y="233" text-anchor="middle" font-size="11" font-weight="600" fill="#ffffff" dominant-baseline="middle"&gt;Planning and Task Decomp…&lt;/text&gt;&lt;line x1="316" y1="256" x2="316" y2="296" stroke="#cbd5e1" stroke-width="1.6"/&gt;&lt;rect x="246" y="296" width="140" height="40" rx="11" fill="#f8fafc" filter="url(#sh)"/&gt;&lt;text x="316" y="316" text-anchor="middle" font-size="10" font-weight="600" fill="#0f172a" dominant-baseline="middle"&gt;The Agentic Ref…&lt;/text&gt;&lt;path d="M420,118 C420,170 524,160 524,210" fill="none" stroke="#cbd5e1" stroke-width="2"/&gt;&lt;rect x="446" y="210" width="156" height="46" rx="11" fill="#9f1239" filter="url(#sh)"/&gt;&lt;text x="524" y="233" text-anchor="middle" font-size="11" font-weight="600" fill="#ffffff" dominant-baseline="middle"&gt;Tool Use and Function Ca…&lt;/text&gt;&lt;line x1="524" y1="256" x2="524" y2="296" stroke="#cbd5e1" stroke-width="1.6"/&gt;&lt;rect x="454" y="296" width="140" height="40" rx="11" fill="#f8fafc" filter="url(#sh)"/&gt;&lt;text x="524" y="316" text-anchor="middle" font-size="10" font-weight="600" fill="#0f172a" dominant-baseline="middle"&gt;Agent Framework…&lt;/text&gt;&lt;path d="M420,118 C420,170 732,160 732,210" fill="none" stroke="#cbd5e1" stroke-width="2"/&gt;&lt;rect x="654" y="210" width="156" height="46" rx="11" fill="#4338ca" filter="url(#sh)"/&gt;&lt;text x="732" y="233" text-anchor="middle" font-size="11" font-weight="600" fill="#ffffff" dominant-baseline="middle"&gt;Memory Architectures&lt;/text&gt;&lt;line x1="732" y1="256" x2="732" y2="296" stroke="#cbd5e1" stroke-width="1.6"/&gt;&lt;rect x="662" y="296" width="140" height="40" rx="11" fill="#f8fafc" filter="url(#sh)"/&gt;&lt;text x="732" y="316" text-anchor="middle" font-size="10" font-weight="600" fill="#0f172a" dominant-baseline="middle"&gt;Memory Architec…&lt;/text&gt;&lt;text x="28" y="446" text-anchor="start" font-size="9.5" font-weight="500" fill="#64748b" dominant-baseline="middle"&gt;Agentic AI  •  Data Lineage&lt;/text&gt;&lt;/svg&gt;</w:t>
+        <w:t>&lt;svg xmlns="http://www.w3.org/2000/svg" width="840" height="460" data-tpl="tree" data-pal="11-2" viewBox="0 0 840 460" font-family="Inter, Segoe UI, Arial, sans-serif"&gt;&lt;defs&gt;&lt;marker id="ar" markerWidth="9" markerHeight="9" refX="7" refY="3" orient="auto"&gt;&lt;path d="M0,0 L7,3 L0,6 z" fill="#94a3b8"/&gt;&lt;/marker&gt;&lt;marker id="arw" markerWidth="9" markerHeight="9" refX="7" refY="3" orient="auto"&gt;&lt;path d="M0,0 L7,3 L0,6 z" fill="#ffffff"/&gt;&lt;/marker&gt;&lt;filter id="sh" x="-20%" y="-20%" width="140%" height="140%"&gt;&lt;feDropShadow dx="0" dy="2" stdDeviation="3" flood-color="#0f172a" flood-opacity="0.16"/&gt;&lt;/filter&gt;&lt;/defs&gt;&lt;defs&gt;&lt;linearGradient id="bn2a0c45" x1="0" y1="0" x2="1" y2="0"&gt;&lt;stop offset="0" stop-color="#0e7490"/&gt;&lt;stop offset="1" stop-color="#b45309"/&gt;&lt;/linearGradient&gt;&lt;/defs&gt;&lt;rect width="840" height="460" rx="14" fill="#ffffff"/&gt;&lt;rect x="0" y="0" width="840" height="48" rx="14" fill="url(#bn2a0c45)"/&gt;&lt;rect x="0" y="32" width="840" height="16" fill="url(#bn2a0c45)"/&gt;&lt;text x="420" y="25" text-anchor="middle" font-size="14.5" font-weight="700" fill="#ffffff" dominant-baseline="middle"&gt;Data Lineage - Observability for Agents&lt;/text&gt;&lt;rect x="330" y="70" width="180" height="48" rx="11" fill="#0f172a" filter="url(#sh)"/&gt;&lt;text x="420" y="94" text-anchor="middle" font-size="12" font-weight="600" fill="#ffffff" dominant-baseline="middle"&gt;Agentic AI&lt;/text&gt;&lt;path d="M420,118 C420,170 108,160 108,210" fill="none" stroke="#cbd5e1" stroke-width="2"/&gt;&lt;rect x="30" y="210" width="156" height="46" rx="11" fill="#0e7490" filter="url(#sh)"/&gt;&lt;text x="108" y="228" text-anchor="middle" font-size="9.5" font-weight="600" fill="#ffffff" dominant-baseline="middle"&gt;The Agent Loop: Reason, Act,&lt;/text&gt;&lt;text x="108" y="238" text-anchor="middle" font-size="9.5" font-weight="600" fill="#ffffff" dominant-baseline="middle"&gt;Observe&lt;/text&gt;&lt;line x1="108" y1="256" x2="108" y2="296" stroke="#cbd5e1" stroke-width="1.6"/&gt;&lt;rect x="38" y="296" width="140" height="40" rx="11" fill="#f8fafc" filter="url(#sh)"/&gt;&lt;text x="108" y="311" text-anchor="middle" font-size="8.5" font-weight="600" fill="#0f172a" dominant-baseline="middle"&gt;Planning and Task&lt;/text&gt;&lt;text x="108" y="321" text-anchor="middle" font-size="8.5" font-weight="600" fill="#0f172a" dominant-baseline="middle"&gt;Decomposition&lt;/text&gt;&lt;path d="M420,118 C420,170 316,160 316,210" fill="none" stroke="#cbd5e1" stroke-width="2"/&gt;&lt;rect x="238" y="210" width="156" height="46" rx="11" fill="#b45309" filter="url(#sh)"/&gt;&lt;text x="316" y="228" text-anchor="middle" font-size="9.5" font-weight="600" fill="#ffffff" dominant-baseline="middle"&gt;Planning and Task&lt;/text&gt;&lt;text x="316" y="238" text-anchor="middle" font-size="9.5" font-weight="600" fill="#ffffff" dominant-baseline="middle"&gt;Decomposition&lt;/text&gt;&lt;line x1="316" y1="256" x2="316" y2="296" stroke="#cbd5e1" stroke-width="1.6"/&gt;&lt;rect x="246" y="296" width="140" height="40" rx="11" fill="#f8fafc" filter="url(#sh)"/&gt;&lt;text x="316" y="311" text-anchor="middle" font-size="8.5" font-weight="600" fill="#0f172a" dominant-baseline="middle"&gt;The Agentic Reference&lt;/text&gt;&lt;text x="316" y="321" text-anchor="middle" font-size="8.5" font-weight="600" fill="#0f172a" dominant-baseline="middle"&gt;Architecture&lt;/text&gt;&lt;path d="M420,118 C420,170 524,160 524,210" fill="none" stroke="#cbd5e1" stroke-width="2"/&gt;&lt;rect x="446" y="210" width="156" height="46" rx="11" fill="#9f1239" filter="url(#sh)"/&gt;&lt;text x="524" y="228" text-anchor="middle" font-size="9.5" font-weight="600" fill="#ffffff" dominant-baseline="middle"&gt;Tool Use and Function&lt;/text&gt;&lt;text x="524" y="238" text-anchor="middle" font-size="9.5" font-weight="600" fill="#ffffff" dominant-baseline="middle"&gt;Calling&lt;/text&gt;&lt;line x1="524" y1="256" x2="524" y2="296" stroke="#cbd5e1" stroke-width="1.6"/&gt;&lt;rect x="454" y="296" width="140" height="40" rx="11" fill="#f8fafc" filter="url(#sh)"/&gt;&lt;text x="524" y="311" text-anchor="middle" font-size="8.5" font-weight="600" fill="#0f172a" dominant-baseline="middle"&gt;Agent Frameworks and&lt;/text&gt;&lt;text x="524" y="321" text-anchor="middle" font-size="8.5" font-weight="600" fill="#0f172a" dominant-baseline="middle"&gt;Patterns&lt;/text&gt;&lt;path d="M420,118 C420,170 732,160 732,210" fill="none" stroke="#cbd5e1" stroke-width="2"/&gt;&lt;rect x="654" y="210" width="156" height="46" rx="11" fill="#4338ca" filter="url(#sh)"/&gt;&lt;text x="732" y="233" text-anchor="middle" font-size="11" font-weight="600" fill="#ffffff" dominant-baseline="middle"&gt;Memory Architectures&lt;/text&gt;&lt;line x1="732" y1="256" x2="732" y2="296" stroke="#cbd5e1" stroke-width="1.6"/&gt;&lt;rect x="662" y="296" width="140" height="40" rx="11" fill="#f8fafc" filter="url(#sh)"/&gt;&lt;text x="732" y="316" text-anchor="middle" font-size="10" font-weight="600" fill="#0f172a" dominant-baseline="middle"&gt;Memory Architectures&lt;/text&gt;&lt;text x="28" y="446" text-anchor="start" font-size="9.5" font-weight="500" fill="#64748b" dominant-baseline="middle"&gt;Agentic AI  •  Data Lineage&lt;/text&gt;&lt;/svg&gt;</w:t>
       </w:r>
     </w:p>
     <w:p>
@@ -13022,7 +13022,7 @@
           <w:rFonts w:ascii="Consolas" w:hAnsi="Consolas"/>
           <w:sz w:val="16"/>
         </w:rPr>
-        <w:t>&lt;svg xmlns="http://www.w3.org/2000/svg" width="840" height="460" data-tpl="swimlane" data-pal="10-5" viewBox="0 0 840 460" font-family="Inter, Segoe UI, Arial, sans-serif"&gt;&lt;defs&gt;&lt;marker id="ar" markerWidth="9" markerHeight="9" refX="7" refY="3" orient="auto"&gt;&lt;path d="M0,0 L7,3 L0,6 z" fill="#94a3b8"/&gt;&lt;/marker&gt;&lt;marker id="arw" markerWidth="9" markerHeight="9" refX="7" refY="3" orient="auto"&gt;&lt;path d="M0,0 L7,3 L0,6 z" fill="#ffffff"/&gt;&lt;/marker&gt;&lt;filter id="sh" x="-20%" y="-20%" width="140%" height="140%"&gt;&lt;feDropShadow dx="0" dy="2" stdDeviation="3" flood-color="#0f172a" flood-opacity="0.16"/&gt;&lt;/filter&gt;&lt;/defs&gt;&lt;defs&gt;&lt;linearGradient id="bn8533f18" x1="0" y1="0" x2="1" y2="0"&gt;&lt;stop offset="0" stop-color="#4ade80"/&gt;&lt;stop offset="1" stop-color="#14532d"/&gt;&lt;/linearGradient&gt;&lt;/defs&gt;&lt;rect width="840" height="460" rx="14" fill="#ffffff"/&gt;&lt;rect x="0" y="0" width="840" height="48" rx="14" fill="url(#bn8533f18)"/&gt;&lt;rect x="0" y="32" width="840" height="16" fill="url(#bn8533f18)"/&gt;&lt;text x="420" y="25" text-anchor="middle" font-size="15" font-weight="700" fill="#ffffff" dominant-baseline="middle"&gt;Business Process - Hands-On Lab: Building an End-to-End Agentic…&lt;/text&gt;&lt;rect x="28" y="64" width="784" height="90" rx="10" fill="#f8fafc" stroke="#e2e8f0" stroke-width="1"/&gt;&lt;text x="40" y="109" text-anchor="start" font-size="11" font-weight="700" fill="#64748b" dominant-baseline="middle"&gt;Business&lt;/text&gt;&lt;rect x="158" y="82" width="140" height="54" rx="11" fill="#4ade80" filter="url(#sh)"/&gt;&lt;text x="228" y="109" text-anchor="middle" font-size="10.5" font-weight="600" fill="#ffffff" dominant-baseline="middle"&gt;Agent Frameworks and Pa…&lt;/text&gt;&lt;rect x="318" y="82" width="140" height="54" rx="11" fill="#14532d" filter="url(#sh)"/&gt;&lt;text x="388" y="109" text-anchor="middle" font-size="10.5" font-weight="600" fill="#ffffff" dominant-baseline="middle"&gt;Observability for Agents&lt;/text&gt;&lt;line x1="298" y1="109" x2="318" y2="109" stroke="#94a3b8" stroke-width="2" marker-end="url(#ar)"/&gt;&lt;rect x="478" y="82" width="140" height="54" rx="11" fill="#166534" filter="url(#sh)"/&gt;&lt;text x="548" y="109" text-anchor="middle" font-size="10.5" font-weight="600" fill="#ffffff" dominant-baseline="middle"&gt;The Agentic Reference A…&lt;/text&gt;&lt;line x1="458" y1="109" x2="478" y2="109" stroke="#94a3b8" stroke-width="2" marker-end="url(#ar)"/&gt;&lt;rect x="638" y="82" width="140" height="54" rx="11" fill="#15803d" filter="url(#sh)"/&gt;&lt;text x="708" y="109" text-anchor="middle" font-size="10.5" font-weight="600" fill="#ffffff" dominant-baseline="middle"&gt;From Chatbots to Agents&lt;/text&gt;&lt;line x1="618" y1="109" x2="638" y2="109" stroke="#94a3b8" stroke-width="2" marker-end="url(#ar)"/&gt;&lt;rect x="28" y="164" width="784" height="90" rx="10" fill="#f8fafc" stroke="#e2e8f0" stroke-width="1"/&gt;&lt;text x="40" y="209" text-anchor="start" font-size="11" font-weight="700" fill="#64748b" dominant-baseline="middle"&gt;Application&lt;/text&gt;&lt;rect x="158" y="182" width="140" height="54" rx="11" fill="#14532d" filter="url(#sh)"/&gt;&lt;text x="228" y="209" text-anchor="middle" font-size="10.5" font-weight="600" fill="#ffffff" dominant-baseline="middle"&gt;Agent Frameworks and Pa…&lt;/text&gt;&lt;rect x="318" y="182" width="140" height="54" rx="11" fill="#166534" filter="url(#sh)"/&gt;&lt;text x="388" y="209" text-anchor="middle" font-size="10.5" font-weight="600" fill="#ffffff" dominant-baseline="middle"&gt;Observability for Agents&lt;/text&gt;&lt;line x1="298" y1="209" x2="318" y2="209" stroke="#94a3b8" stroke-width="2" marker-end="url(#ar)"/&gt;&lt;rect x="478" y="182" width="140" height="54" rx="11" fill="#15803d" filter="url(#sh)"/&gt;&lt;text x="548" y="209" text-anchor="middle" font-size="10.5" font-weight="600" fill="#ffffff" dominant-baseline="middle"&gt;The Agentic Reference A…&lt;/text&gt;&lt;line x1="458" y1="209" x2="478" y2="209" stroke="#94a3b8" stroke-width="2" marker-end="url(#ar)"/&gt;&lt;rect x="638" y="182" width="140" height="54" rx="11" fill="#16a34a" filter="url(#sh)"/&gt;&lt;text x="708" y="209" text-anchor="middle" font-size="10.5" font-weight="600" fill="#ffffff" dominant-baseline="middle"&gt;From Chatbots to Agents&lt;/text&gt;&lt;line x1="618" y1="209" x2="638" y2="209" stroke="#94a3b8" stroke-width="2" marker-end="url(#ar)"/&gt;&lt;rect x="28" y="264" width="784" height="90" rx="10" fill="#f8fafc" stroke="#e2e8f0" stroke-width="1"/&gt;&lt;text x="40" y="309" text-anchor="start" font-size="11" font-weight="700" fill="#64748b" dominant-baseline="middle"&gt;Data&lt;/text&gt;&lt;rect x="158" y="282" width="140" height="54" rx="11" fill="#166534" filter="url(#sh)"/&gt;&lt;text x="228" y="309" text-anchor="middle" font-size="10.5" font-weight="600" fill="#ffffff" dominant-baseline="middle"&gt;Human-in-the-Loop and A…&lt;/text&gt;&lt;rect x="318" y="282" width="140" height="54" rx="11" fill="#15803d" filter="url(#sh)"/&gt;&lt;text x="388" y="309" text-anchor="middle" font-size="10.5" font-weight="600" fill="#ffffff" dominant-baseline="middle"&gt;Safety, Sandboxing and …&lt;/text&gt;&lt;line x1="298" y1="309" x2="318" y2="309" stroke="#94a3b8" stroke-width="2" marker-end="url(#ar)"/&gt;&lt;rect x="478" y="282" width="140" height="54" rx="11" fill="#16a34a" filter="url(#sh)"/&gt;&lt;text x="548" y="309" text-anchor="middle" font-size="10.5" font-weight="600" fill="#ffffff" dominant-baseline="middle"&gt;Cost, Latency and Loop …&lt;/text&gt;&lt;line x1="458" y1="309" x2="478" y2="309" stroke="#94a3b8" stroke-width="2" marker-end="url(#ar)"/&gt;&lt;rect x="638" y="282" width="140" height="54" rx="11" fill="#22c55e" filter="url(#sh)"/&gt;&lt;text x="708" y="309" text-anchor="middle" font-size="10.5" font-weight="600" fill="#ffffff" dominant-baseline="middle"&gt;Evaluating Agents&lt;/text&gt;&lt;line x1="618" y1="309" x2="638" y2="309" stroke="#94a3b8" stroke-width="2" marker-end="url(#ar)"/&gt;&lt;text x="28" y="446" text-anchor="start" font-size="9.5" font-weight="500" fill="#64748b" dominant-baseline="middle"&gt;Agentic AI  •  Business Process&lt;/text&gt;&lt;/svg&gt;</w:t>
+        <w:t>&lt;svg xmlns="http://www.w3.org/2000/svg" width="840" height="460" data-tpl="swimlane" data-pal="10-5" viewBox="0 0 840 460" font-family="Inter, Segoe UI, Arial, sans-serif"&gt;&lt;defs&gt;&lt;marker id="ar" markerWidth="9" markerHeight="9" refX="7" refY="3" orient="auto"&gt;&lt;path d="M0,0 L7,3 L0,6 z" fill="#94a3b8"/&gt;&lt;/marker&gt;&lt;marker id="arw" markerWidth="9" markerHeight="9" refX="7" refY="3" orient="auto"&gt;&lt;path d="M0,0 L7,3 L0,6 z" fill="#ffffff"/&gt;&lt;/marker&gt;&lt;filter id="sh" x="-20%" y="-20%" width="140%" height="140%"&gt;&lt;feDropShadow dx="0" dy="2" stdDeviation="3" flood-color="#0f172a" flood-opacity="0.16"/&gt;&lt;/filter&gt;&lt;/defs&gt;&lt;defs&gt;&lt;linearGradient id="bn8533f18" x1="0" y1="0" x2="1" y2="0"&gt;&lt;stop offset="0" stop-color="#4ade80"/&gt;&lt;stop offset="1" stop-color="#14532d"/&gt;&lt;/linearGradient&gt;&lt;/defs&gt;&lt;rect width="840" height="460" rx="14" fill="#ffffff"/&gt;&lt;rect x="0" y="0" width="840" height="48" rx="14" fill="url(#bn8533f18)"/&gt;&lt;rect x="0" y="32" width="840" height="16" fill="url(#bn8533f18)"/&gt;&lt;text x="420" y="25" text-anchor="middle" font-size="14.5" font-weight="700" fill="#ffffff" dominant-baseline="middle"&gt;Business Process - Hands-On Lab: Building an End-to-End Agentic AI System&lt;/text&gt;&lt;rect x="28" y="64" width="784" height="90" rx="10" fill="#f8fafc" stroke="#e2e8f0" stroke-width="1"/&gt;&lt;text x="40" y="109" text-anchor="start" font-size="11" font-weight="700" fill="#64748b" dominant-baseline="middle"&gt;Business&lt;/text&gt;&lt;rect x="158" y="82" width="140" height="54" rx="11" fill="#4ade80" filter="url(#sh)"/&gt;&lt;text x="228" y="104" text-anchor="middle" font-size="9.0" font-weight="600" fill="#ffffff" dominant-baseline="middle"&gt;Agent Frameworks and&lt;/text&gt;&lt;text x="228" y="114" text-anchor="middle" font-size="9.0" font-weight="600" fill="#ffffff" dominant-baseline="middle"&gt;Patterns&lt;/text&gt;&lt;rect x="318" y="82" width="140" height="54" rx="11" fill="#14532d" filter="url(#sh)"/&gt;&lt;text x="388" y="109" text-anchor="middle" font-size="9.0" font-weight="600" fill="#ffffff" dominant-baseline="middle"&gt;Observability for Agents&lt;/text&gt;&lt;line x1="298" y1="109" x2="318" y2="109" stroke="#94a3b8" stroke-width="2" marker-end="url(#ar)"/&gt;&lt;rect x="478" y="82" width="140" height="54" rx="11" fill="#166534" filter="url(#sh)"/&gt;&lt;text x="548" y="104" text-anchor="middle" font-size="9.0" font-weight="600" fill="#ffffff" dominant-baseline="middle"&gt;The Agentic Reference&lt;/text&gt;&lt;text x="548" y="114" text-anchor="middle" font-size="9.0" font-weight="600" fill="#ffffff" dominant-baseline="middle"&gt;Architecture&lt;/text&gt;&lt;line x1="458" y1="109" x2="478" y2="109" stroke="#94a3b8" stroke-width="2" marker-end="url(#ar)"/&gt;&lt;rect x="638" y="82" width="140" height="54" rx="11" fill="#15803d" filter="url(#sh)"/&gt;&lt;text x="708" y="109" text-anchor="middle" font-size="9.0" font-weight="600" fill="#ffffff" dominant-baseline="middle"&gt;From Chatbots to Agents&lt;/text&gt;&lt;line x1="618" y1="109" x2="638" y2="109" stroke="#94a3b8" stroke-width="2" marker-end="url(#ar)"/&gt;&lt;rect x="28" y="164" width="784" height="90" rx="10" fill="#f8fafc" stroke="#e2e8f0" stroke-width="1"/&gt;&lt;text x="40" y="209" text-anchor="start" font-size="11" font-weight="700" fill="#64748b" dominant-baseline="middle"&gt;Application&lt;/text&gt;&lt;rect x="158" y="182" width="140" height="54" rx="11" fill="#14532d" filter="url(#sh)"/&gt;&lt;text x="228" y="204" text-anchor="middle" font-size="9.0" font-weight="600" fill="#ffffff" dominant-baseline="middle"&gt;Agent Frameworks and&lt;/text&gt;&lt;text x="228" y="214" text-anchor="middle" font-size="9.0" font-weight="600" fill="#ffffff" dominant-baseline="middle"&gt;Patterns&lt;/text&gt;&lt;rect x="318" y="182" width="140" height="54" rx="11" fill="#166534" filter="url(#sh)"/&gt;&lt;text x="388" y="209" text-anchor="middle" font-size="9.0" font-weight="600" fill="#ffffff" dominant-baseline="middle"&gt;Observability for Agents&lt;/text&gt;&lt;line x1="298" y1="209" x2="318" y2="209" stroke="#94a3b8" stroke-width="2" marker-end="url(#ar)"/&gt;&lt;rect x="478" y="182" width="140" height="54" rx="11" fill="#15803d" filter="url(#sh)"/&gt;&lt;text x="548" y="204" text-anchor="middle" font-size="9.0" font-weight="600" fill="#ffffff" dominant-baseline="middle"&gt;The Agentic Reference&lt;/text&gt;&lt;text x="548" y="214" text-anchor="middle" font-size="9.0" font-weight="600" fill="#ffffff" dominant-baseline="middle"&gt;Architecture&lt;/text&gt;&lt;line x1="458" y1="209" x2="478" y2="209" stroke="#94a3b8" stroke-width="2" marker-end="url(#ar)"/&gt;&lt;rect x="638" y="182" width="140" height="54" rx="11" fill="#16a34a" filter="url(#sh)"/&gt;&lt;text x="708" y="209" text-anchor="middle" font-size="9.0" font-weight="600" fill="#ffffff" dominant-baseline="middle"&gt;From Chatbots to Agents&lt;/text&gt;&lt;line x1="618" y1="209" x2="638" y2="209" stroke="#94a3b8" stroke-width="2" marker-end="url(#ar)"/&gt;&lt;rect x="28" y="264" width="784" height="90" rx="10" fill="#f8fafc" stroke="#e2e8f0" stroke-width="1"/&gt;&lt;text x="40" y="309" text-anchor="start" font-size="11" font-weight="700" fill="#64748b" dominant-baseline="middle"&gt;Data&lt;/text&gt;&lt;rect x="158" y="282" width="140" height="54" rx="11" fill="#166534" filter="url(#sh)"/&gt;&lt;text x="228" y="304" text-anchor="middle" font-size="9.0" font-weight="600" fill="#ffffff" dominant-baseline="middle"&gt;Human-in-the-Loop and&lt;/text&gt;&lt;text x="228" y="314" text-anchor="middle" font-size="9.0" font-weight="600" fill="#ffffff" dominant-baseline="middle"&gt;Approvals&lt;/text&gt;&lt;rect x="318" y="282" width="140" height="54" rx="11" fill="#15803d" filter="url(#sh)"/&gt;&lt;text x="388" y="304" text-anchor="middle" font-size="9.0" font-weight="600" fill="#ffffff" dominant-baseline="middle"&gt;Safety, Sandboxing and&lt;/text&gt;&lt;text x="388" y="314" text-anchor="middle" font-size="9.0" font-weight="600" fill="#ffffff" dominant-baseline="middle"&gt;Permissions&lt;/text&gt;&lt;line x1="298" y1="309" x2="318" y2="309" stroke="#94a3b8" stroke-width="2" marker-end="url(#ar)"/&gt;&lt;rect x="478" y="282" width="140" height="54" rx="11" fill="#16a34a" filter="url(#sh)"/&gt;&lt;text x="548" y="304" text-anchor="middle" font-size="9.0" font-weight="600" fill="#ffffff" dominant-baseline="middle"&gt;Cost, Latency and Loop&lt;/text&gt;&lt;text x="548" y="314" text-anchor="middle" font-size="9.0" font-weight="600" fill="#ffffff" dominant-baseline="middle"&gt;Control&lt;/text&gt;&lt;line x1="458" y1="309" x2="478" y2="309" stroke="#94a3b8" stroke-width="2" marker-end="url(#ar)"/&gt;&lt;rect x="638" y="282" width="140" height="54" rx="11" fill="#22c55e" filter="url(#sh)"/&gt;&lt;text x="708" y="309" text-anchor="middle" font-size="10.5" font-weight="600" fill="#ffffff" dominant-baseline="middle"&gt;Evaluating Agents&lt;/text&gt;&lt;line x1="618" y1="309" x2="638" y2="309" stroke="#94a3b8" stroke-width="2" marker-end="url(#ar)"/&gt;&lt;text x="28" y="446" text-anchor="start" font-size="9.5" font-weight="500" fill="#64748b" dominant-baseline="middle"&gt;Agentic AI  •  Business Process&lt;/text&gt;&lt;/svg&gt;</w:t>
       </w:r>
     </w:p>
     <w:p>
@@ -15600,7 +15600,7 @@
           <w:rFonts w:ascii="Consolas" w:hAnsi="Consolas"/>
           <w:sz w:val="16"/>
         </w:rPr>
-        <w:t>&lt;svg xmlns="http://www.w3.org/2000/svg" width="840" height="460" data-tpl="cycle" data-pal="11-1" viewBox="0 0 840 460" font-family="Inter, Segoe UI, Arial, sans-serif"&gt;&lt;defs&gt;&lt;marker id="ar" markerWidth="9" markerHeight="9" refX="7" refY="3" orient="auto"&gt;&lt;path d="M0,0 L7,3 L0,6 z" fill="#94a3b8"/&gt;&lt;/marker&gt;&lt;marker id="arw" markerWidth="9" markerHeight="9" refX="7" refY="3" orient="auto"&gt;&lt;path d="M0,0 L7,3 L0,6 z" fill="#ffffff"/&gt;&lt;/marker&gt;&lt;filter id="sh" x="-20%" y="-20%" width="140%" height="140%"&gt;&lt;feDropShadow dx="0" dy="2" stdDeviation="3" flood-color="#0f172a" flood-opacity="0.16"/&gt;&lt;/filter&gt;&lt;/defs&gt;&lt;defs&gt;&lt;linearGradient id="bnbb1ff" x1="0" y1="0" x2="1" y2="0"&gt;&lt;stop offset="0" stop-color="#1e40af"/&gt;&lt;stop offset="1" stop-color="#0e7490"/&gt;&lt;/linearGradient&gt;&lt;/defs&gt;&lt;rect width="840" height="460" rx="14" fill="#ffffff"/&gt;&lt;rect x="0" y="0" width="840" height="48" rx="14" fill="url(#bnbb1ff)"/&gt;&lt;rect x="0" y="32" width="840" height="16" fill="url(#bnbb1ff)"/&gt;&lt;text x="420" y="25" text-anchor="middle" font-size="15" font-weight="700" fill="#ffffff" dominant-baseline="middle"&gt;Agent Architecture - Evaluation and Quality Assurance&lt;/text&gt;&lt;rect x="348" y="86" width="144" height="44" rx="11" fill="#1e40af" filter="url(#sh)"/&gt;&lt;text x="420" y="108" text-anchor="middle" font-size="11" font-weight="600" fill="#ffffff" dominant-baseline="middle"&gt;Evaluating Agents&lt;/text&gt;&lt;rect x="472" y="176" width="144" height="44" rx="11" fill="#0e7490" filter="url(#sh)"/&gt;&lt;text x="544" y="198" text-anchor="middle" font-size="11" font-weight="600" fill="#ffffff" dominant-baseline="middle"&gt;Agent Frameworks and P…&lt;/text&gt;&lt;rect x="424" y="321" width="144" height="44" rx="11" fill="#b45309" filter="url(#sh)"/&gt;&lt;text x="496" y="343" text-anchor="middle" font-size="11" font-weight="600" fill="#ffffff" dominant-baseline="middle"&gt;Observability for Agen…&lt;/text&gt;&lt;rect x="272" y="321" width="144" height="44" rx="11" fill="#9f1239" filter="url(#sh)"/&gt;&lt;text x="344" y="343" text-anchor="middle" font-size="11" font-weight="600" fill="#ffffff" dominant-baseline="middle"&gt;The Agentic Reference …&lt;/text&gt;&lt;rect x="224" y="176" width="144" height="44" rx="11" fill="#4338ca" filter="url(#sh)"/&gt;&lt;text x="296" y="198" text-anchor="middle" font-size="11" font-weight="600" fill="#ffffff" dominant-baseline="middle"&gt;From Chatbots to Agents&lt;/text&gt;&lt;path d="M461,147 A100,100 0 0 1 494,171" fill="none" stroke="#cbd5e1" stroke-width="2" marker-end="url(#ar)"/&gt;&lt;path d="M519,249 A100,100 0 0 1 507,288" fill="none" stroke="#cbd5e1" stroke-width="2" marker-end="url(#ar)"/&gt;&lt;path d="M441,336 A100,100 0 0 1 399,336" fill="none" stroke="#cbd5e1" stroke-width="2" marker-end="url(#ar)"/&gt;&lt;path d="M333,288 A100,100 0 0 1 321,249" fill="none" stroke="#cbd5e1" stroke-width="2" marker-end="url(#ar)"/&gt;&lt;path d="M346,171 A100,100 0 0 1 379,147" fill="none" stroke="#cbd5e1" stroke-width="2" marker-end="url(#ar)"/&gt;&lt;text x="420" y="238" text-anchor="middle" font-size="12" font-weight="600" fill="#64748b" dominant-baseline="middle"&gt;continuous&lt;/text&gt;&lt;text x="28" y="446" text-anchor="start" font-size="9.5" font-weight="500" fill="#64748b" dominant-baseline="middle"&gt;Agentic AI  •  Agent Architecture&lt;/text&gt;&lt;/svg&gt;</w:t>
+        <w:t>&lt;svg xmlns="http://www.w3.org/2000/svg" width="840" height="460" data-tpl="cycle" data-pal="11-1" viewBox="0 0 840 460" font-family="Inter, Segoe UI, Arial, sans-serif"&gt;&lt;defs&gt;&lt;marker id="ar" markerWidth="9" markerHeight="9" refX="7" refY="3" orient="auto"&gt;&lt;path d="M0,0 L7,3 L0,6 z" fill="#94a3b8"/&gt;&lt;/marker&gt;&lt;marker id="arw" markerWidth="9" markerHeight="9" refX="7" refY="3" orient="auto"&gt;&lt;path d="M0,0 L7,3 L0,6 z" fill="#ffffff"/&gt;&lt;/marker&gt;&lt;filter id="sh" x="-20%" y="-20%" width="140%" height="140%"&gt;&lt;feDropShadow dx="0" dy="2" stdDeviation="3" flood-color="#0f172a" flood-opacity="0.16"/&gt;&lt;/filter&gt;&lt;/defs&gt;&lt;defs&gt;&lt;linearGradient id="bnbb1ff" x1="0" y1="0" x2="1" y2="0"&gt;&lt;stop offset="0" stop-color="#1e40af"/&gt;&lt;stop offset="1" stop-color="#0e7490"/&gt;&lt;/linearGradient&gt;&lt;/defs&gt;&lt;rect width="840" height="460" rx="14" fill="#ffffff"/&gt;&lt;rect x="0" y="0" width="840" height="48" rx="14" fill="url(#bnbb1ff)"/&gt;&lt;rect x="0" y="32" width="840" height="16" fill="url(#bnbb1ff)"/&gt;&lt;text x="420" y="25" text-anchor="middle" font-size="14.5" font-weight="700" fill="#ffffff" dominant-baseline="middle"&gt;Agent Architecture - Evaluation and Quality Assurance&lt;/text&gt;&lt;rect x="348" y="86" width="144" height="44" rx="11" fill="#1e40af" filter="url(#sh)"/&gt;&lt;text x="420" y="108" text-anchor="middle" font-size="11" font-weight="600" fill="#ffffff" dominant-baseline="middle"&gt;Evaluating Agents&lt;/text&gt;&lt;rect x="472" y="176" width="144" height="44" rx="11" fill="#0e7490" filter="url(#sh)"/&gt;&lt;text x="544" y="192" text-anchor="middle" font-size="9.5" font-weight="600" fill="#ffffff" dominant-baseline="middle"&gt;Agent Frameworks and&lt;/text&gt;&lt;text x="544" y="203" text-anchor="middle" font-size="9.5" font-weight="600" fill="#ffffff" dominant-baseline="middle"&gt;Patterns&lt;/text&gt;&lt;rect x="424" y="321" width="144" height="44" rx="11" fill="#b45309" filter="url(#sh)"/&gt;&lt;text x="496" y="343" text-anchor="middle" font-size="9.5" font-weight="600" fill="#ffffff" dominant-baseline="middle"&gt;Observability for Agents&lt;/text&gt;&lt;rect x="272" y="321" width="144" height="44" rx="11" fill="#9f1239" filter="url(#sh)"/&gt;&lt;text x="344" y="338" text-anchor="middle" font-size="9.5" font-weight="600" fill="#ffffff" dominant-baseline="middle"&gt;The Agentic Reference&lt;/text&gt;&lt;text x="344" y="349" text-anchor="middle" font-size="9.5" font-weight="600" fill="#ffffff" dominant-baseline="middle"&gt;Architecture&lt;/text&gt;&lt;rect x="224" y="176" width="144" height="44" rx="11" fill="#4338ca" filter="url(#sh)"/&gt;&lt;text x="296" y="198" text-anchor="middle" font-size="9.5" font-weight="600" fill="#ffffff" dominant-baseline="middle"&gt;From Chatbots to Agents&lt;/text&gt;&lt;path d="M461,147 A100,100 0 0 1 494,171" fill="none" stroke="#cbd5e1" stroke-width="2" marker-end="url(#ar)"/&gt;&lt;path d="M519,249 A100,100 0 0 1 507,288" fill="none" stroke="#cbd5e1" stroke-width="2" marker-end="url(#ar)"/&gt;&lt;path d="M441,336 A100,100 0 0 1 399,336" fill="none" stroke="#cbd5e1" stroke-width="2" marker-end="url(#ar)"/&gt;&lt;path d="M333,288 A100,100 0 0 1 321,249" fill="none" stroke="#cbd5e1" stroke-width="2" marker-end="url(#ar)"/&gt;&lt;path d="M346,171 A100,100 0 0 1 379,147" fill="none" stroke="#cbd5e1" stroke-width="2" marker-end="url(#ar)"/&gt;&lt;text x="420" y="238" text-anchor="middle" font-size="12" font-weight="600" fill="#64748b" dominant-baseline="middle"&gt;continuous&lt;/text&gt;&lt;text x="28" y="446" text-anchor="start" font-size="9.5" font-weight="500" fill="#64748b" dominant-baseline="middle"&gt;Agentic AI  •  Agent Architecture&lt;/text&gt;&lt;/svg&gt;</w:t>
       </w:r>
     </w:p>
     <w:p>
@@ -17223,7 +17223,7 @@
           <w:rFonts w:ascii="Consolas" w:hAnsi="Consolas"/>
           <w:sz w:val="16"/>
         </w:rPr>
-        <w:t>&lt;svg xmlns="http://www.w3.org/2000/svg" width="840" height="460" data-tpl="cycle" data-pal="0-0" viewBox="0 0 840 460" font-family="Inter, Segoe UI, Arial, sans-serif"&gt;&lt;defs&gt;&lt;marker id="ar" markerWidth="9" markerHeight="9" refX="7" refY="3" orient="auto"&gt;&lt;path d="M0,0 L7,3 L0,6 z" fill="#94a3b8"/&gt;&lt;/marker&gt;&lt;marker id="arw" markerWidth="9" markerHeight="9" refX="7" refY="3" orient="auto"&gt;&lt;path d="M0,0 L7,3 L0,6 z" fill="#ffffff"/&gt;&lt;/marker&gt;&lt;filter id="sh" x="-20%" y="-20%" width="140%" height="140%"&gt;&lt;feDropShadow dx="0" dy="2" stdDeviation="3" flood-color="#0f172a" flood-opacity="0.16"/&gt;&lt;/filter&gt;&lt;/defs&gt;&lt;defs&gt;&lt;linearGradient id="bncc0f0c3" x1="0" y1="0" x2="1" y2="0"&gt;&lt;stop offset="0" stop-color="#4338ca"/&gt;&lt;stop offset="1" stop-color="#6d28d9"/&gt;&lt;/linearGradient&gt;&lt;/defs&gt;&lt;rect width="840" height="460" rx="14" fill="#ffffff"/&gt;&lt;rect x="0" y="0" width="840" height="48" rx="14" fill="url(#bncc0f0c3)"/&gt;&lt;rect x="0" y="32" width="840" height="16" fill="url(#bncc0f0c3)"/&gt;&lt;text x="420" y="25" text-anchor="middle" font-size="15" font-weight="700" fill="#ffffff" dominant-baseline="middle"&gt;CI/CD Pipeline - Cost, Performance and Scaling&lt;/text&gt;&lt;rect x="348" y="86" width="144" height="44" rx="11" fill="#4338ca" filter="url(#sh)"/&gt;&lt;text x="420" y="108" text-anchor="middle" font-size="11" font-weight="600" fill="#ffffff" dominant-baseline="middle"&gt;The Agent Loop: Reason…&lt;/text&gt;&lt;rect x="472" y="176" width="144" height="44" rx="11" fill="#6d28d9" filter="url(#sh)"/&gt;&lt;text x="544" y="198" text-anchor="middle" font-size="11" font-weight="600" fill="#ffffff" dominant-baseline="middle"&gt;Planning and Task Deco…&lt;/text&gt;&lt;rect x="424" y="321" width="144" height="44" rx="11" fill="#7c3aed" filter="url(#sh)"/&gt;&lt;text x="496" y="343" text-anchor="middle" font-size="11" font-weight="600" fill="#ffffff" dominant-baseline="middle"&gt;Tool Use and Function …&lt;/text&gt;&lt;rect x="272" y="321" width="144" height="44" rx="11" fill="#8b5cf6" filter="url(#sh)"/&gt;&lt;text x="344" y="343" text-anchor="middle" font-size="11" font-weight="600" fill="#ffffff" dominant-baseline="middle"&gt;Memory Architectures&lt;/text&gt;&lt;rect x="224" y="176" width="144" height="44" rx="11" fill="#a78bfa" filter="url(#sh)"/&gt;&lt;text x="296" y="198" text-anchor="middle" font-size="11" font-weight="600" fill="#ffffff" dominant-baseline="middle"&gt;Reflection and Self-Co…&lt;/text&gt;&lt;path d="M461,147 A100,100 0 0 1 494,171" fill="none" stroke="#cbd5e1" stroke-width="2" marker-end="url(#ar)"/&gt;&lt;path d="M519,249 A100,100 0 0 1 507,288" fill="none" stroke="#cbd5e1" stroke-width="2" marker-end="url(#ar)"/&gt;&lt;path d="M441,336 A100,100 0 0 1 399,336" fill="none" stroke="#cbd5e1" stroke-width="2" marker-end="url(#ar)"/&gt;&lt;path d="M333,288 A100,100 0 0 1 321,249" fill="none" stroke="#cbd5e1" stroke-width="2" marker-end="url(#ar)"/&gt;&lt;path d="M346,171 A100,100 0 0 1 379,147" fill="none" stroke="#cbd5e1" stroke-width="2" marker-end="url(#ar)"/&gt;&lt;text x="420" y="238" text-anchor="middle" font-size="12" font-weight="600" fill="#64748b" dominant-baseline="middle"&gt;continuous&lt;/text&gt;&lt;text x="28" y="446" text-anchor="start" font-size="9.5" font-weight="500" fill="#64748b" dominant-baseline="middle"&gt;Agentic AI  •  CI/CD Pipeline&lt;/text&gt;&lt;/svg&gt;</w:t>
+        <w:t>&lt;svg xmlns="http://www.w3.org/2000/svg" width="840" height="460" data-tpl="cycle" data-pal="0-0" viewBox="0 0 840 460" font-family="Inter, Segoe UI, Arial, sans-serif"&gt;&lt;defs&gt;&lt;marker id="ar" markerWidth="9" markerHeight="9" refX="7" refY="3" orient="auto"&gt;&lt;path d="M0,0 L7,3 L0,6 z" fill="#94a3b8"/&gt;&lt;/marker&gt;&lt;marker id="arw" markerWidth="9" markerHeight="9" refX="7" refY="3" orient="auto"&gt;&lt;path d="M0,0 L7,3 L0,6 z" fill="#ffffff"/&gt;&lt;/marker&gt;&lt;filter id="sh" x="-20%" y="-20%" width="140%" height="140%"&gt;&lt;feDropShadow dx="0" dy="2" stdDeviation="3" flood-color="#0f172a" flood-opacity="0.16"/&gt;&lt;/filter&gt;&lt;/defs&gt;&lt;defs&gt;&lt;linearGradient id="bncc0f0c3" x1="0" y1="0" x2="1" y2="0"&gt;&lt;stop offset="0" stop-color="#4338ca"/&gt;&lt;stop offset="1" stop-color="#6d28d9"/&gt;&lt;/linearGradient&gt;&lt;/defs&gt;&lt;rect width="840" height="460" rx="14" fill="#ffffff"/&gt;&lt;rect x="0" y="0" width="840" height="48" rx="14" fill="url(#bncc0f0c3)"/&gt;&lt;rect x="0" y="32" width="840" height="16" fill="url(#bncc0f0c3)"/&gt;&lt;text x="420" y="25" text-anchor="middle" font-size="14.5" font-weight="700" fill="#ffffff" dominant-baseline="middle"&gt;CI/CD Pipeline - Cost, Performance and Scaling&lt;/text&gt;&lt;rect x="348" y="86" width="144" height="44" rx="11" fill="#4338ca" filter="url(#sh)"/&gt;&lt;text x="420" y="103" text-anchor="middle" font-size="9.5" font-weight="600" fill="#ffffff" dominant-baseline="middle"&gt;The Agent Loop: Reason,&lt;/text&gt;&lt;text x="420" y="113" text-anchor="middle" font-size="9.5" font-weight="600" fill="#ffffff" dominant-baseline="middle"&gt;Act, Observe&lt;/text&gt;&lt;rect x="472" y="176" width="144" height="44" rx="11" fill="#6d28d9" filter="url(#sh)"/&gt;&lt;text x="544" y="192" text-anchor="middle" font-size="9.5" font-weight="600" fill="#ffffff" dominant-baseline="middle"&gt;Planning and Task&lt;/text&gt;&lt;text x="544" y="203" text-anchor="middle" font-size="9.5" font-weight="600" fill="#ffffff" dominant-baseline="middle"&gt;Decomposition&lt;/text&gt;&lt;rect x="424" y="321" width="144" height="44" rx="11" fill="#7c3aed" filter="url(#sh)"/&gt;&lt;text x="496" y="338" text-anchor="middle" font-size="9.5" font-weight="600" fill="#ffffff" dominant-baseline="middle"&gt;Tool Use and Function&lt;/text&gt;&lt;text x="496" y="349" text-anchor="middle" font-size="9.5" font-weight="600" fill="#ffffff" dominant-baseline="middle"&gt;Calling&lt;/text&gt;&lt;rect x="272" y="321" width="144" height="44" rx="11" fill="#8b5cf6" filter="url(#sh)"/&gt;&lt;text x="344" y="343" text-anchor="middle" font-size="11" font-weight="600" fill="#ffffff" dominant-baseline="middle"&gt;Memory Architectures&lt;/text&gt;&lt;rect x="224" y="176" width="144" height="44" rx="11" fill="#a78bfa" filter="url(#sh)"/&gt;&lt;text x="296" y="192" text-anchor="middle" font-size="9.5" font-weight="600" fill="#ffffff" dominant-baseline="middle"&gt;Reflection and&lt;/text&gt;&lt;text x="296" y="203" text-anchor="middle" font-size="9.5" font-weight="600" fill="#ffffff" dominant-baseline="middle"&gt;Self-Correction&lt;/text&gt;&lt;path d="M461,147 A100,100 0 0 1 494,171" fill="none" stroke="#cbd5e1" stroke-width="2" marker-end="url(#ar)"/&gt;&lt;path d="M519,249 A100,100 0 0 1 507,288" fill="none" stroke="#cbd5e1" stroke-width="2" marker-end="url(#ar)"/&gt;&lt;path d="M441,336 A100,100 0 0 1 399,336" fill="none" stroke="#cbd5e1" stroke-width="2" marker-end="url(#ar)"/&gt;&lt;path d="M333,288 A100,100 0 0 1 321,249" fill="none" stroke="#cbd5e1" stroke-width="2" marker-end="url(#ar)"/&gt;&lt;path d="M346,171 A100,100 0 0 1 379,147" fill="none" stroke="#cbd5e1" stroke-width="2" marker-end="url(#ar)"/&gt;&lt;text x="420" y="238" text-anchor="middle" font-size="12" font-weight="600" fill="#64748b" dominant-baseline="middle"&gt;continuous&lt;/text&gt;&lt;text x="28" y="446" text-anchor="start" font-size="9.5" font-weight="500" fill="#64748b" dominant-baseline="middle"&gt;Agentic AI  •  CI/CD Pipeline&lt;/text&gt;&lt;/svg&gt;</w:t>
       </w:r>
     </w:p>
     <w:p>
@@ -19581,7 +19581,7 @@
           <w:rFonts w:ascii="Consolas" w:hAnsi="Consolas"/>
           <w:sz w:val="16"/>
         </w:rPr>
-        <w:t>&lt;svg xmlns="http://www.w3.org/2000/svg" width="840" height="460" data-tpl="kpi" data-pal="2-4" viewBox="0 0 840 460" font-family="Inter, Segoe UI, Arial, sans-serif"&gt;&lt;defs&gt;&lt;marker id="ar" markerWidth="9" markerHeight="9" refX="7" refY="3" orient="auto"&gt;&lt;path d="M0,0 L7,3 L0,6 z" fill="#94a3b8"/&gt;&lt;/marker&gt;&lt;marker id="arw" markerWidth="9" markerHeight="9" refX="7" refY="3" orient="auto"&gt;&lt;path d="M0,0 L7,3 L0,6 z" fill="#ffffff"/&gt;&lt;/marker&gt;&lt;filter id="sh" x="-20%" y="-20%" width="140%" height="140%"&gt;&lt;feDropShadow dx="0" dy="2" stdDeviation="3" flood-color="#0f172a" flood-opacity="0.16"/&gt;&lt;/filter&gt;&lt;/defs&gt;&lt;defs&gt;&lt;linearGradient id="bn32754ff" x1="0" y1="0" x2="1" y2="0"&gt;&lt;stop offset="0" stop-color="#0d9488"/&gt;&lt;stop offset="1" stop-color="#14b8a6"/&gt;&lt;/linearGradient&gt;&lt;/defs&gt;&lt;rect width="840" height="460" rx="14" fill="#ffffff"/&gt;&lt;rect x="0" y="0" width="840" height="48" rx="14" fill="url(#bn32754ff)"/&gt;&lt;rect x="0" y="32" width="840" height="16" fill="url(#bn32754ff)"/&gt;&lt;text x="420" y="25" text-anchor="middle" font-size="15" font-weight="700" fill="#ffffff" dominant-baseline="middle"&gt;Capability Map - Capstone Project&lt;/text&gt;&lt;rect x="28" y="90" width="182" height="150" rx="14" fill="#f8fafc" stroke="#e2e8f0" stroke-width="1"/&gt;&lt;rect x="28" y="90" width="182" height="8" rx="0" fill="#0d9488"/&gt;&lt;text x="119" y="150" text-anchor="middle" font-size="30" font-weight="800" fill="#0d9488" dominant-baseline="middle"&gt;70%&lt;/text&gt;&lt;text x="119" y="200" text-anchor="middle" font-size="11" font-weight="600" fill="#64748b" dominant-baseline="middle"&gt;Planning and Task…&lt;/text&gt;&lt;rect x="228" y="90" width="182" height="150" rx="14" fill="#f8fafc" stroke="#e2e8f0" stroke-width="1"/&gt;&lt;rect x="228" y="90" width="182" height="8" rx="0" fill="#14b8a6"/&gt;&lt;text x="320" y="150" text-anchor="middle" font-size="30" font-weight="800" fill="#14b8a6" dominant-baseline="middle"&gt;52%&lt;/text&gt;&lt;text x="320" y="200" text-anchor="middle" font-size="11" font-weight="600" fill="#64748b" dominant-baseline="middle"&gt;Tool Use and Func…&lt;/text&gt;&lt;rect x="429" y="90" width="182" height="150" rx="14" fill="#f8fafc" stroke="#e2e8f0" stroke-width="1"/&gt;&lt;rect x="429" y="90" width="182" height="8" rx="0" fill="#047857"/&gt;&lt;text x="520" y="150" text-anchor="middle" font-size="30" font-weight="800" fill="#047857" dominant-baseline="middle"&gt;89%&lt;/text&gt;&lt;text x="520" y="200" text-anchor="middle" font-size="11" font-weight="600" fill="#64748b" dominant-baseline="middle"&gt;Memory Architectu…&lt;/text&gt;&lt;rect x="630" y="90" width="182" height="150" rx="14" fill="#f8fafc" stroke="#e2e8f0" stroke-width="1"/&gt;&lt;rect x="630" y="90" width="182" height="8" rx="0" fill="#059669"/&gt;&lt;text x="721" y="150" text-anchor="middle" font-size="30" font-weight="800" fill="#059669" dominant-baseline="middle"&gt;64%&lt;/text&gt;&lt;text x="721" y="200" text-anchor="middle" font-size="11" font-weight="600" fill="#64748b" dominant-baseline="middle"&gt;Reflection and Se…&lt;/text&gt;&lt;text x="28" y="446" text-anchor="start" font-size="9.5" font-weight="500" fill="#64748b" dominant-baseline="middle"&gt;Agentic AI  •  Capability Map&lt;/text&gt;&lt;/svg&gt;</w:t>
+        <w:t>&lt;svg xmlns="http://www.w3.org/2000/svg" width="840" height="460" data-tpl="kpi" data-pal="2-4" viewBox="0 0 840 460" font-family="Inter, Segoe UI, Arial, sans-serif"&gt;&lt;defs&gt;&lt;marker id="ar" markerWidth="9" markerHeight="9" refX="7" refY="3" orient="auto"&gt;&lt;path d="M0,0 L7,3 L0,6 z" fill="#94a3b8"/&gt;&lt;/marker&gt;&lt;marker id="arw" markerWidth="9" markerHeight="9" refX="7" refY="3" orient="auto"&gt;&lt;path d="M0,0 L7,3 L0,6 z" fill="#ffffff"/&gt;&lt;/marker&gt;&lt;filter id="sh" x="-20%" y="-20%" width="140%" height="140%"&gt;&lt;feDropShadow dx="0" dy="2" stdDeviation="3" flood-color="#0f172a" flood-opacity="0.16"/&gt;&lt;/filter&gt;&lt;/defs&gt;&lt;defs&gt;&lt;linearGradient id="bn32754ff" x1="0" y1="0" x2="1" y2="0"&gt;&lt;stop offset="0" stop-color="#0d9488"/&gt;&lt;stop offset="1" stop-color="#14b8a6"/&gt;&lt;/linearGradient&gt;&lt;/defs&gt;&lt;rect width="840" height="460" rx="14" fill="#ffffff"/&gt;&lt;rect x="0" y="0" width="840" height="48" rx="14" fill="url(#bn32754ff)"/&gt;&lt;rect x="0" y="32" width="840" height="16" fill="url(#bn32754ff)"/&gt;&lt;text x="420" y="25" text-anchor="middle" font-size="14.5" font-weight="700" fill="#ffffff" dominant-baseline="middle"&gt;Capability Map - Capstone Project&lt;/text&gt;&lt;rect x="28" y="90" width="182" height="150" rx="14" fill="#f8fafc" stroke="#e2e8f0" stroke-width="1"/&gt;&lt;rect x="28" y="90" width="182" height="8" rx="0" fill="#0d9488"/&gt;&lt;text x="119" y="150" text-anchor="middle" font-size="30" font-weight="800" fill="#0d9488" dominant-baseline="middle"&gt;70%&lt;/text&gt;&lt;text x="119" y="192" text-anchor="middle" font-size="11" font-weight="600" fill="#64748b" dominant-baseline="middle"&gt;Planning and Task&lt;/text&gt;&lt;text x="119" y="204" text-anchor="middle" font-size="11" font-weight="600" fill="#64748b" dominant-baseline="middle"&gt;Decomposition&lt;/text&gt;&lt;rect x="228" y="90" width="182" height="150" rx="14" fill="#f8fafc" stroke="#e2e8f0" stroke-width="1"/&gt;&lt;rect x="228" y="90" width="182" height="8" rx="0" fill="#14b8a6"/&gt;&lt;text x="320" y="150" text-anchor="middle" font-size="30" font-weight="800" fill="#14b8a6" dominant-baseline="middle"&gt;52%&lt;/text&gt;&lt;text x="320" y="192" text-anchor="middle" font-size="11" font-weight="600" fill="#64748b" dominant-baseline="middle"&gt;Tool Use and Function&lt;/text&gt;&lt;text x="320" y="204" text-anchor="middle" font-size="11" font-weight="600" fill="#64748b" dominant-baseline="middle"&gt;Calling&lt;/text&gt;&lt;rect x="429" y="90" width="182" height="150" rx="14" fill="#f8fafc" stroke="#e2e8f0" stroke-width="1"/&gt;&lt;rect x="429" y="90" width="182" height="8" rx="0" fill="#047857"/&gt;&lt;text x="520" y="150" text-anchor="middle" font-size="30" font-weight="800" fill="#047857" dominant-baseline="middle"&gt;89%&lt;/text&gt;&lt;text x="520" y="198" text-anchor="middle" font-size="11" font-weight="600" fill="#64748b" dominant-baseline="middle"&gt;Memory Architectures&lt;/text&gt;&lt;rect x="630" y="90" width="182" height="150" rx="14" fill="#f8fafc" stroke="#e2e8f0" stroke-width="1"/&gt;&lt;rect x="630" y="90" width="182" height="8" rx="0" fill="#059669"/&gt;&lt;text x="721" y="150" text-anchor="middle" font-size="30" font-weight="800" fill="#059669" dominant-baseline="middle"&gt;64%&lt;/text&gt;&lt;text x="721" y="192" text-anchor="middle" font-size="11" font-weight="600" fill="#64748b" dominant-baseline="middle"&gt;Reflection and&lt;/text&gt;&lt;text x="721" y="204" text-anchor="middle" font-size="11" font-weight="600" fill="#64748b" dominant-baseline="middle"&gt;Self-Correction&lt;/text&gt;&lt;text x="28" y="446" text-anchor="start" font-size="9.5" font-weight="500" fill="#64748b" dominant-baseline="middle"&gt;Agentic AI  •  Capability Map&lt;/text&gt;&lt;/svg&gt;</w:t>
       </w:r>
     </w:p>
     <w:p>

</xml_diff>